<commit_message>
modified headers, function decomposition detailed decription removed, test points added
</commit_message>
<xml_diff>
--- a/docs/LLD/AltitudeMeasurement_LLD.docx
+++ b/docs/LLD/AltitudeMeasurement_LLD.docx
@@ -45,10 +45,15 @@
         <w:t>Purpose</w:t>
       </w:r>
     </w:p>
-    <w:p/>
     <w:p>
       <w:r>
-        <w:t xml:space="preserve">The Purpose of this document is to provide a blueprint of the Altitude </w:t>
+        <w:t xml:space="preserve">The Purpose of this document is to provide a </w:t>
+      </w:r>
+      <w:r>
+        <w:t>low level design</w:t>
+      </w:r>
+      <w:r>
+        <w:t xml:space="preserve"> of the Altitude </w:t>
       </w:r>
       <w:r>
         <w:t xml:space="preserve">measurement. It </w:t>
@@ -95,7 +100,6 @@
         <w:t>2. Functional Decomposition</w:t>
       </w:r>
     </w:p>
-    <w:p/>
     <w:p>
       <w:pPr>
         <w:pStyle w:val="Heading2"/>
@@ -127,48 +131,305 @@
       </w:r>
     </w:p>
     <w:p>
-      <w:pPr>
-        <w:pStyle w:val="ListParagraph"/>
-        <w:numPr>
-          <w:ilvl w:val="0"/>
-          <w:numId w:val="11"/>
-        </w:numPr>
-      </w:pPr>
-      <w:r>
-        <w:t xml:space="preserve">Declare boolean  variable </w:t>
+      <w:r>
+        <w:t>Initialization of sensor module.</w:t>
+      </w:r>
+    </w:p>
+    <w:p>
+      <w:pPr>
+        <w:pStyle w:val="Heading4"/>
+      </w:pPr>
+      <w:r>
+        <w:t>2.1.2 SensorAltitudeMeasure()</w:t>
+      </w:r>
+    </w:p>
+    <w:p>
+      <w:r>
+        <w:t>Act as key entry point</w:t>
+      </w:r>
+      <w:r>
+        <w:t xml:space="preserve">, </w:t>
+      </w:r>
+      <w:r>
+        <w:t>initialize IPC and concurrent execution unit.</w:t>
+      </w:r>
+    </w:p>
+    <w:p>
+      <w:pPr>
+        <w:pStyle w:val="Heading4"/>
+      </w:pPr>
+      <w:r>
+        <w:t>2.1.</w:t>
+      </w:r>
+      <w:r>
+        <w:t>3</w:t>
+      </w:r>
+      <w:r>
+        <w:t xml:space="preserve"> </w:t>
+      </w:r>
+      <w:r>
+        <w:t>SensorReadHandler</w:t>
+      </w:r>
+      <w:r>
+        <w:t>()</w:t>
+      </w:r>
+    </w:p>
+    <w:p>
+      <w:r>
+        <w:tab/>
+      </w:r>
+      <w:r>
+        <w:t>Acting as the entry point for sensor Handler, this function manages the data flow of sensor module to message queue.</w:t>
+      </w:r>
+      <w:r>
+        <w:t xml:space="preserve"> </w:t>
+      </w:r>
+    </w:p>
+    <w:p>
+      <w:pPr>
+        <w:pStyle w:val="Heading4"/>
+      </w:pPr>
+      <w:r>
+        <w:t>2.1.</w:t>
+      </w:r>
+      <w:r>
+        <w:t>4</w:t>
+      </w:r>
+      <w:r>
+        <w:t xml:space="preserve"> SensorDataRead()</w:t>
+      </w:r>
+    </w:p>
+    <w:p>
+      <w:r>
+        <w:t>This subroutine is responsible for reading data from the sensor module. Using [C] protocol, it fetches data from the  module.</w:t>
+      </w:r>
+    </w:p>
+    <w:p>
+      <w:pPr>
+        <w:pStyle w:val="Heading3"/>
+      </w:pPr>
+      <w:r>
+        <w:t>2.2 Validat</w:t>
+      </w:r>
+      <w:r>
+        <w:t>ion</w:t>
+      </w:r>
+      <w:r>
+        <w:t xml:space="preserve"> Engine</w:t>
+      </w:r>
+    </w:p>
+    <w:p>
+      <w:r>
+        <w:t>The Validation engine performs the processing of data and validation</w:t>
+      </w:r>
+      <w:r>
+        <w:t xml:space="preserve">. Process the message queue and validate with </w:t>
       </w:r>
       <w:r>
         <w:rPr>
           <w:i/>
           <w:iCs/>
         </w:rPr>
-        <w:t xml:space="preserve">[blReturnSuccess] set </w:t>
-      </w:r>
-      <w:r>
-        <w:t>as false.</w:t>
+        <w:t>[THRESHOLD_MIN, THRESHOLD_MAX].</w:t>
+      </w:r>
+      <w:r>
+        <w:t>Following are the details of available functions and subroutines.</w:t>
       </w:r>
     </w:p>
     <w:p>
       <w:pPr>
-        <w:pStyle w:val="ListParagraph"/>
-        <w:numPr>
-          <w:ilvl w:val="0"/>
-          <w:numId w:val="11"/>
-        </w:numPr>
+        <w:pStyle w:val="Heading4"/>
+      </w:pPr>
+      <w:r>
+        <w:t xml:space="preserve">2.2.1 </w:t>
+      </w:r>
+      <w:r>
+        <w:t>ProcessSensorData</w:t>
+      </w:r>
+      <w:r>
+        <w:t>()</w:t>
+      </w:r>
+    </w:p>
+    <w:p>
+      <w:pPr>
+        <w:rPr>
+          <w:rFonts w:asciiTheme="majorHAnsi" w:hAnsiTheme="majorHAnsi" w:cstheme="majorHAnsi"/>
+        </w:rPr>
+      </w:pPr>
+      <w:r>
+        <w:rPr>
+          <w:rFonts w:asciiTheme="majorHAnsi" w:hAnsiTheme="majorHAnsi" w:cstheme="majorHAnsi"/>
+        </w:rPr>
+        <w:t>Serve</w:t>
+      </w:r>
+      <w:r>
+        <w:rPr>
+          <w:rFonts w:asciiTheme="majorHAnsi" w:hAnsiTheme="majorHAnsi" w:cstheme="majorHAnsi"/>
+        </w:rPr>
+        <w:t xml:space="preserve"> as a validate </w:t>
+      </w:r>
+      <w:r>
+        <w:rPr>
+          <w:rFonts w:asciiTheme="majorHAnsi" w:hAnsiTheme="majorHAnsi" w:cstheme="majorHAnsi"/>
+        </w:rPr>
+        <w:t>engine</w:t>
+      </w:r>
+      <w:r>
+        <w:rPr>
+          <w:rFonts w:asciiTheme="majorHAnsi" w:hAnsiTheme="majorHAnsi" w:cstheme="majorHAnsi"/>
+        </w:rPr>
+        <w:t xml:space="preserve">,  </w:t>
+      </w:r>
+      <w:r>
+        <w:rPr>
+          <w:rFonts w:asciiTheme="majorHAnsi" w:hAnsiTheme="majorHAnsi" w:cstheme="majorHAnsi"/>
+        </w:rPr>
+        <w:t>it de-queues the message packet,</w:t>
+      </w:r>
+      <w:r>
+        <w:rPr>
+          <w:rFonts w:asciiTheme="majorHAnsi" w:hAnsiTheme="majorHAnsi" w:cstheme="majorHAnsi"/>
+        </w:rPr>
+        <w:t xml:space="preserve"> </w:t>
+      </w:r>
+      <w:r>
+        <w:rPr>
+          <w:rFonts w:asciiTheme="majorHAnsi" w:hAnsiTheme="majorHAnsi" w:cstheme="majorHAnsi"/>
+        </w:rPr>
+        <w:t xml:space="preserve"> extract the raw data and </w:t>
+      </w:r>
+      <w:r>
+        <w:rPr>
+          <w:rFonts w:asciiTheme="majorHAnsi" w:hAnsiTheme="majorHAnsi" w:cstheme="majorHAnsi"/>
+        </w:rPr>
+        <w:t>perform validation and set event signal based on the processed output.</w:t>
+      </w:r>
+    </w:p>
+    <w:p>
+      <w:pPr>
+        <w:pStyle w:val="Heading4"/>
+      </w:pPr>
+      <w:r>
+        <w:lastRenderedPageBreak/>
+        <w:t>2.2.2</w:t>
+      </w:r>
+      <w:r>
+        <w:t xml:space="preserve"> </w:t>
+      </w:r>
+      <w:r>
+        <w:t>ProcessValidateAlititude</w:t>
+      </w:r>
+      <w:r>
+        <w:t>()</w:t>
+      </w:r>
+    </w:p>
+    <w:p>
+      <w:r>
+        <w:rPr>
+          <w:rFonts w:asciiTheme="majorHAnsi" w:hAnsiTheme="majorHAnsi" w:cstheme="majorHAnsi"/>
+        </w:rPr>
+        <w:t xml:space="preserve">This will check the altitude value we pass with  </w:t>
+      </w:r>
+      <w:r>
         <w:rPr>
           <w:i/>
           <w:iCs/>
         </w:rPr>
-      </w:pPr>
-      <w:r>
-        <w:t xml:space="preserve">Input parameter is frequency </w:t>
-      </w:r>
-      <w:r>
+        <w:t>[THRESHOLD_MIN, THRESHOLD_MAX].</w:t>
+      </w:r>
+      <w:r>
+        <w:t>Return value as per the conditions.</w:t>
+      </w:r>
+    </w:p>
+    <w:p>
+      <w:pPr>
+        <w:pStyle w:val="Heading3"/>
+      </w:pPr>
+      <w:r>
+        <w:t>2.3 Alarm Management</w:t>
+      </w:r>
+    </w:p>
+    <w:p>
+      <w:pPr>
         <w:rPr>
-          <w:i/>
-          <w:iCs/>
+          <w:rFonts w:asciiTheme="majorHAnsi" w:hAnsiTheme="majorHAnsi" w:cstheme="majorHAnsi"/>
         </w:rPr>
-        <w:t>[</w:t>
+      </w:pPr>
+      <w:r>
+        <w:rPr>
+          <w:rFonts w:asciiTheme="majorHAnsi" w:hAnsiTheme="majorHAnsi" w:cstheme="majorHAnsi"/>
+        </w:rPr>
+        <w:t>Monitors the event system group and manages alarm triggering</w:t>
+      </w:r>
+      <w:r>
+        <w:rPr>
+          <w:rFonts w:asciiTheme="majorHAnsi" w:hAnsiTheme="majorHAnsi" w:cstheme="majorHAnsi"/>
+        </w:rPr>
+        <w:t>.</w:t>
+      </w:r>
+    </w:p>
+    <w:p>
+      <w:pPr>
+        <w:pStyle w:val="Heading4"/>
+      </w:pPr>
+      <w:r>
+        <w:t xml:space="preserve">2.3.1 </w:t>
+      </w:r>
+      <w:r>
+        <w:t>AlarmInfoProcessHandler</w:t>
+      </w:r>
+      <w:r>
+        <w:t>()</w:t>
+      </w:r>
+    </w:p>
+    <w:p>
+      <w:r>
+        <w:t>Validate the event flag and trigger the alarm.</w:t>
+      </w:r>
+    </w:p>
+    <w:p>
+      <w:pPr>
+        <w:pStyle w:val="Heading2"/>
+      </w:pPr>
+      <w:r>
+        <w:t>3. Detailed Function Descriptions</w:t>
+      </w:r>
+    </w:p>
+    <w:p>
+      <w:pPr>
+        <w:pStyle w:val="Heading3"/>
+      </w:pPr>
+      <w:r>
+        <w:t>3.1.Function Prototypes</w:t>
+      </w:r>
+    </w:p>
+    <w:p>
+      <w:r>
+        <w:t xml:space="preserve">This module </w:t>
+      </w:r>
+      <w:r>
+        <w:t>describes</w:t>
+      </w:r>
+      <w:r>
+        <w:t xml:space="preserve"> the prototypes of </w:t>
+      </w:r>
+      <w:r>
+        <w:t>above-mentioned</w:t>
+      </w:r>
+      <w:r>
+        <w:t xml:space="preserve"> functions.</w:t>
+      </w:r>
+    </w:p>
+    <w:p>
+      <w:pPr>
+        <w:pStyle w:val="ListParagraph"/>
+        <w:numPr>
+          <w:ilvl w:val="0"/>
+          <w:numId w:val="20"/>
+        </w:numPr>
+      </w:pPr>
+      <w:r>
+        <w:t>bool SensorInitialization(</w:t>
       </w:r>
       <w:r>
         <w:rPr>
@@ -178,1186 +439,7 @@
         <w:t>uint32_t ulFrequency</w:t>
       </w:r>
       <w:r>
-        <w:rPr>
-          <w:i/>
-          <w:iCs/>
-        </w:rPr>
-        <w:t>].</w:t>
-      </w:r>
-    </w:p>
-    <w:p>
-      <w:pPr>
-        <w:pStyle w:val="ListParagraph"/>
-        <w:numPr>
-          <w:ilvl w:val="0"/>
-          <w:numId w:val="11"/>
-        </w:numPr>
-      </w:pPr>
-      <w:r>
-        <w:t>Check if the frequency [</w:t>
-      </w:r>
-      <w:r>
-        <w:rPr>
-          <w:i/>
-          <w:iCs/>
-        </w:rPr>
-        <w:t>ulFrequency</w:t>
-      </w:r>
-      <w:r>
-        <w:t xml:space="preserve">] is valid or not , If valid set frequency value to the corresponding parameter. Set the boolean  variable </w:t>
-      </w:r>
-      <w:r>
-        <w:rPr>
-          <w:i/>
-          <w:iCs/>
-        </w:rPr>
-        <w:t xml:space="preserve">[blReturnSuccess] </w:t>
-      </w:r>
-      <w:r>
-        <w:t>value as true.</w:t>
-      </w:r>
-    </w:p>
-    <w:p>
-      <w:pPr>
-        <w:pStyle w:val="ListParagraph"/>
-        <w:numPr>
-          <w:ilvl w:val="0"/>
-          <w:numId w:val="11"/>
-        </w:numPr>
-      </w:pPr>
-      <w:r>
-        <w:t xml:space="preserve">Return the </w:t>
-      </w:r>
-      <w:r>
-        <w:t>Boolean</w:t>
-      </w:r>
-      <w:r>
-        <w:t xml:space="preserve">  variable </w:t>
-      </w:r>
-      <w:r>
-        <w:rPr>
-          <w:i/>
-          <w:iCs/>
-        </w:rPr>
-        <w:t>[blReturnSuccess]</w:t>
-      </w:r>
-      <w:r>
-        <w:t>.</w:t>
-      </w:r>
-    </w:p>
-    <w:p>
-      <w:pPr>
-        <w:pStyle w:val="Heading4"/>
-      </w:pPr>
-      <w:r>
-        <w:t>2.1.2 SensorAltitudeMeasure()</w:t>
-      </w:r>
-    </w:p>
-    <w:p>
-      <w:r>
-        <w:t>Act as key entry point</w:t>
-      </w:r>
-      <w:r>
-        <w:t xml:space="preserve">, </w:t>
-      </w:r>
-      <w:r>
-        <w:t>initialize IPC and concurrent execution unit.</w:t>
-      </w:r>
-    </w:p>
-    <w:p>
-      <w:pPr>
-        <w:pStyle w:val="ListParagraph"/>
-        <w:numPr>
-          <w:ilvl w:val="0"/>
-          <w:numId w:val="18"/>
-        </w:numPr>
-      </w:pPr>
-      <w:r>
-        <w:t xml:space="preserve">Create </w:t>
-      </w:r>
-      <w:r>
-        <w:t>Message queue creation and</w:t>
-      </w:r>
-      <w:r>
-        <w:rPr>
-          <w:rFonts w:asciiTheme="majorHAnsi" w:hAnsiTheme="majorHAnsi" w:cstheme="majorHAnsi"/>
-        </w:rPr>
-        <w:t xml:space="preserve"> </w:t>
-      </w:r>
-      <w:r>
-        <w:rPr>
-          <w:rFonts w:asciiTheme="majorHAnsi" w:hAnsiTheme="majorHAnsi" w:cstheme="majorHAnsi"/>
-        </w:rPr>
-        <w:t>Event group creation</w:t>
-      </w:r>
-      <w:r>
-        <w:t xml:space="preserve">. </w:t>
-      </w:r>
-      <w:r>
-        <w:t>Check the resource handler , if It’s NULL exit with warning message.</w:t>
-      </w:r>
-    </w:p>
-    <w:p>
-      <w:pPr>
-        <w:pStyle w:val="ListParagraph"/>
-        <w:numPr>
-          <w:ilvl w:val="0"/>
-          <w:numId w:val="18"/>
-        </w:numPr>
-      </w:pPr>
-      <w:r>
-        <w:t xml:space="preserve">Launch three functional threads  for </w:t>
-      </w:r>
-      <w:r>
-        <w:t>SensorReadHandler</w:t>
-      </w:r>
-      <w:r>
-        <w:t>()</w:t>
-      </w:r>
-      <w:r>
-        <w:t xml:space="preserve">, </w:t>
-      </w:r>
-      <w:r>
-        <w:rPr>
-          <w:rFonts w:asciiTheme="majorHAnsi" w:hAnsiTheme="majorHAnsi" w:cstheme="majorHAnsi"/>
-        </w:rPr>
-        <w:t>ProcessSensorData()</w:t>
-      </w:r>
-      <w:r>
-        <w:rPr>
-          <w:rFonts w:asciiTheme="majorHAnsi" w:hAnsiTheme="majorHAnsi" w:cstheme="majorHAnsi"/>
-        </w:rPr>
-        <w:t xml:space="preserve"> and  </w:t>
-      </w:r>
-      <w:r>
-        <w:rPr>
-          <w:rFonts w:asciiTheme="majorHAnsi" w:hAnsiTheme="majorHAnsi" w:cstheme="majorHAnsi"/>
-        </w:rPr>
-        <w:t>AlarmInfoProcessHandler().</w:t>
-      </w:r>
-      <w:r>
-        <w:rPr>
-          <w:rFonts w:asciiTheme="majorHAnsi" w:hAnsiTheme="majorHAnsi" w:cstheme="majorHAnsi"/>
-        </w:rPr>
-        <w:t xml:space="preserve"> Check the handler values , if it </w:t>
-      </w:r>
-      <w:r>
-        <w:rPr>
-          <w:rFonts w:asciiTheme="majorHAnsi" w:hAnsiTheme="majorHAnsi" w:cstheme="majorHAnsi"/>
-        </w:rPr>
-        <w:t>gives</w:t>
-      </w:r>
-      <w:r>
-        <w:rPr>
-          <w:rFonts w:asciiTheme="majorHAnsi" w:hAnsiTheme="majorHAnsi" w:cstheme="majorHAnsi"/>
-        </w:rPr>
-        <w:t xml:space="preserve"> NULL exit with warning message.</w:t>
-      </w:r>
-    </w:p>
-    <w:p>
-      <w:pPr>
-        <w:pStyle w:val="ListParagraph"/>
-        <w:numPr>
-          <w:ilvl w:val="0"/>
-          <w:numId w:val="18"/>
-        </w:numPr>
-        <w:rPr>
-          <w:rFonts w:asciiTheme="majorHAnsi" w:hAnsiTheme="majorHAnsi" w:cstheme="majorHAnsi"/>
-        </w:rPr>
-      </w:pPr>
-      <w:r>
-        <w:rPr>
-          <w:rFonts w:asciiTheme="majorHAnsi" w:hAnsiTheme="majorHAnsi" w:cstheme="majorHAnsi"/>
-        </w:rPr>
-        <w:t>Call thread_</w:t>
-      </w:r>
-      <w:r>
-        <w:rPr>
-          <w:rFonts w:asciiTheme="majorHAnsi" w:hAnsiTheme="majorHAnsi" w:cstheme="majorHAnsi"/>
-        </w:rPr>
-        <w:t>detach</w:t>
-      </w:r>
-      <w:r>
-        <w:rPr>
-          <w:rFonts w:asciiTheme="majorHAnsi" w:hAnsiTheme="majorHAnsi" w:cstheme="majorHAnsi"/>
-        </w:rPr>
-        <w:t xml:space="preserve">() to </w:t>
-      </w:r>
-      <w:r>
-        <w:rPr>
-          <w:rFonts w:asciiTheme="majorHAnsi" w:hAnsiTheme="majorHAnsi" w:cstheme="majorHAnsi"/>
-        </w:rPr>
-        <w:t>maintain the background task.</w:t>
-      </w:r>
-    </w:p>
-    <w:p>
-      <w:pPr>
-        <w:rPr>
-          <w:rFonts w:asciiTheme="majorHAnsi" w:hAnsiTheme="majorHAnsi" w:cstheme="majorHAnsi"/>
-        </w:rPr>
-      </w:pPr>
-    </w:p>
-    <w:p>
-      <w:pPr>
-        <w:rPr>
-          <w:rFonts w:asciiTheme="majorHAnsi" w:hAnsiTheme="majorHAnsi" w:cstheme="majorHAnsi"/>
-        </w:rPr>
-      </w:pPr>
-    </w:p>
-    <w:p>
-      <w:pPr>
-        <w:pStyle w:val="Heading4"/>
-      </w:pPr>
-      <w:r>
-        <w:lastRenderedPageBreak/>
-        <w:t>2.1.</w:t>
-      </w:r>
-      <w:r>
-        <w:t>3</w:t>
-      </w:r>
-      <w:r>
-        <w:t xml:space="preserve"> </w:t>
-      </w:r>
-      <w:r>
-        <w:t>SensorReadHandler</w:t>
-      </w:r>
-      <w:r>
-        <w:t>()</w:t>
-      </w:r>
-    </w:p>
-    <w:p>
-      <w:r>
-        <w:tab/>
-      </w:r>
-      <w:r>
-        <w:t>Acting as the entry point for sensor Handler, this function manages the data flow of sensor module to message queue.</w:t>
-      </w:r>
-      <w:r>
-        <w:t xml:space="preserve"> </w:t>
-      </w:r>
-    </w:p>
-    <w:p>
-      <w:pPr>
-        <w:pStyle w:val="ListParagraph"/>
-        <w:numPr>
-          <w:ilvl w:val="0"/>
-          <w:numId w:val="13"/>
-        </w:numPr>
-      </w:pPr>
-      <w:r>
-        <w:t xml:space="preserve">Set initial interval timer </w:t>
-      </w:r>
-      <w:r>
-        <w:rPr>
-          <w:i/>
-          <w:iCs/>
-        </w:rPr>
-        <w:t>[I].</w:t>
-      </w:r>
-    </w:p>
-    <w:p>
-      <w:pPr>
-        <w:pStyle w:val="ListParagraph"/>
-        <w:numPr>
-          <w:ilvl w:val="0"/>
-          <w:numId w:val="13"/>
-        </w:numPr>
-      </w:pPr>
-      <w:r>
-        <w:t>Wait for</w:t>
-      </w:r>
-      <w:r>
-        <w:t xml:space="preserve"> the </w:t>
-      </w:r>
-      <w:r>
-        <w:t>timer</w:t>
-      </w:r>
-      <w:r>
-        <w:t xml:space="preserve"> </w:t>
-      </w:r>
-      <w:r>
-        <w:t xml:space="preserve">expiry </w:t>
-      </w:r>
-      <w:r>
-        <w:rPr>
-          <w:i/>
-          <w:iCs/>
-        </w:rPr>
-        <w:t>[I].</w:t>
-      </w:r>
-    </w:p>
-    <w:p>
-      <w:pPr>
-        <w:pStyle w:val="ListParagraph"/>
-        <w:numPr>
-          <w:ilvl w:val="0"/>
-          <w:numId w:val="13"/>
-        </w:numPr>
-      </w:pPr>
-      <w:r>
-        <w:t xml:space="preserve">Invoke </w:t>
-      </w:r>
-      <w:r>
-        <w:t xml:space="preserve"> SensorDataRead()</w:t>
-      </w:r>
-      <w:r>
-        <w:t xml:space="preserve"> when timeout reaches.</w:t>
-      </w:r>
-    </w:p>
-    <w:p>
-      <w:pPr>
-        <w:pStyle w:val="ListParagraph"/>
-        <w:numPr>
-          <w:ilvl w:val="0"/>
-          <w:numId w:val="13"/>
-        </w:numPr>
-      </w:pPr>
-      <w:r>
-        <w:t>Pack the raw altitude data into the message queue packet.</w:t>
-      </w:r>
-    </w:p>
-    <w:p>
-      <w:pPr>
-        <w:pStyle w:val="ListParagraph"/>
-        <w:numPr>
-          <w:ilvl w:val="0"/>
-          <w:numId w:val="13"/>
-        </w:numPr>
-      </w:pPr>
-      <w:r>
-        <w:t>Push the packet into the message queue.</w:t>
-      </w:r>
-    </w:p>
-    <w:p>
-      <w:pPr>
-        <w:pStyle w:val="ListParagraph"/>
-        <w:numPr>
-          <w:ilvl w:val="0"/>
-          <w:numId w:val="13"/>
-        </w:numPr>
-      </w:pPr>
-      <w:r>
-        <w:t xml:space="preserve">Reinitialize the Interval timer </w:t>
-      </w:r>
-      <w:r>
-        <w:rPr>
-          <w:i/>
-          <w:iCs/>
-        </w:rPr>
-        <w:t>[I].</w:t>
-      </w:r>
-    </w:p>
-    <w:p>
-      <w:pPr>
-        <w:pStyle w:val="ListParagraph"/>
-      </w:pPr>
-    </w:p>
-    <w:p>
-      <w:pPr>
-        <w:pStyle w:val="Heading4"/>
-      </w:pPr>
-      <w:r>
-        <w:t>2.1.</w:t>
-      </w:r>
-      <w:r>
-        <w:t>4</w:t>
-      </w:r>
-      <w:r>
-        <w:t xml:space="preserve"> </w:t>
-      </w:r>
-      <w:r>
-        <w:t>SensorDataRead</w:t>
-      </w:r>
-      <w:r>
-        <w:t>()</w:t>
-      </w:r>
-    </w:p>
-    <w:p>
-      <w:r>
-        <w:t>This subroutine is responsible for reading data from the sensor module. Using [C] protocol, it fetches data from the  module.</w:t>
-      </w:r>
-    </w:p>
-    <w:p>
-      <w:pPr>
-        <w:pStyle w:val="ListParagraph"/>
-      </w:pPr>
-    </w:p>
-    <w:p>
-      <w:pPr>
-        <w:pStyle w:val="ListParagraph"/>
-        <w:numPr>
-          <w:ilvl w:val="0"/>
-          <w:numId w:val="13"/>
-        </w:numPr>
-      </w:pPr>
-      <w:r>
-        <w:t>Declare and initialize</w:t>
-      </w:r>
-      <w:r>
-        <w:t xml:space="preserve"> </w:t>
-      </w:r>
-      <w:r>
-        <w:t>an</w:t>
-      </w:r>
-      <w:r>
-        <w:t xml:space="preserve"> </w:t>
-      </w:r>
-      <w:r>
-        <w:t>unsigned in</w:t>
-      </w:r>
-      <w:r>
-        <w:t xml:space="preserve">teger </w:t>
-      </w:r>
-      <w:r>
-        <w:t xml:space="preserve">variable </w:t>
-      </w:r>
-      <w:r>
-        <w:rPr>
-          <w:i/>
-          <w:iCs/>
-        </w:rPr>
-        <w:t>[uint32_t ulAltitudeData]</w:t>
-      </w:r>
-    </w:p>
-    <w:p>
-      <w:pPr>
-        <w:pStyle w:val="ListParagraph"/>
-        <w:numPr>
-          <w:ilvl w:val="0"/>
-          <w:numId w:val="13"/>
-        </w:numPr>
-      </w:pPr>
-      <w:r>
-        <w:t xml:space="preserve">Communicate with the module for data using [C] protocol and save to </w:t>
-      </w:r>
-      <w:r>
-        <w:rPr>
-          <w:i/>
-          <w:iCs/>
-        </w:rPr>
-        <w:t>[uint32_t ulAltitudeData]</w:t>
-      </w:r>
-    </w:p>
-    <w:p>
-      <w:pPr>
-        <w:pStyle w:val="ListParagraph"/>
-        <w:numPr>
-          <w:ilvl w:val="0"/>
-          <w:numId w:val="13"/>
-        </w:numPr>
-      </w:pPr>
-      <w:r>
-        <w:t xml:space="preserve">Return the </w:t>
-      </w:r>
-      <w:r>
-        <w:rPr>
-          <w:i/>
-          <w:iCs/>
-        </w:rPr>
-        <w:t>[uint32_t ulAltitudeData]</w:t>
-      </w:r>
-      <w:r>
-        <w:rPr>
-          <w:i/>
-          <w:iCs/>
-        </w:rPr>
-        <w:t>.</w:t>
-      </w:r>
-    </w:p>
-    <w:p>
-      <w:pPr>
-        <w:pStyle w:val="Heading3"/>
-      </w:pPr>
-      <w:r>
-        <w:t>2.2 Validat</w:t>
-      </w:r>
-      <w:r>
-        <w:t>ion</w:t>
-      </w:r>
-      <w:r>
-        <w:t xml:space="preserve"> Engine</w:t>
-      </w:r>
-    </w:p>
-    <w:p/>
-    <w:p>
-      <w:r>
-        <w:t>The Validation engine performs the processing of data and validation</w:t>
-      </w:r>
-      <w:r>
-        <w:t xml:space="preserve">. Process the message queue and validate with </w:t>
-      </w:r>
-      <w:r>
-        <w:rPr>
-          <w:i/>
-          <w:iCs/>
-        </w:rPr>
-        <w:t>[THRESHOLD_MIN, THRESHOLD_MAX].</w:t>
-      </w:r>
-      <w:r>
-        <w:t>Following are the details of available functions and subroutines.</w:t>
-      </w:r>
-    </w:p>
-    <w:p>
-      <w:pPr>
-        <w:rPr>
-          <w:rFonts w:asciiTheme="majorHAnsi" w:hAnsiTheme="majorHAnsi" w:cstheme="majorHAnsi"/>
-        </w:rPr>
-      </w:pPr>
-      <w:r>
-        <w:t xml:space="preserve">2.2.1 </w:t>
-      </w:r>
-      <w:r>
-        <w:rPr>
-          <w:rFonts w:asciiTheme="majorHAnsi" w:hAnsiTheme="majorHAnsi" w:cstheme="majorHAnsi"/>
-        </w:rPr>
-        <w:t>ProcessSensorData</w:t>
-      </w:r>
-      <w:r>
-        <w:rPr>
-          <w:rFonts w:asciiTheme="majorHAnsi" w:hAnsiTheme="majorHAnsi" w:cstheme="majorHAnsi"/>
-        </w:rPr>
-        <w:t>()</w:t>
-      </w:r>
-    </w:p>
-    <w:p>
-      <w:pPr>
-        <w:rPr>
-          <w:rFonts w:asciiTheme="majorHAnsi" w:hAnsiTheme="majorHAnsi" w:cstheme="majorHAnsi"/>
-        </w:rPr>
-      </w:pPr>
-      <w:r>
-        <w:rPr>
-          <w:rFonts w:asciiTheme="majorHAnsi" w:hAnsiTheme="majorHAnsi" w:cstheme="majorHAnsi"/>
-        </w:rPr>
-        <w:t>Serve</w:t>
-      </w:r>
-      <w:r>
-        <w:rPr>
-          <w:rFonts w:asciiTheme="majorHAnsi" w:hAnsiTheme="majorHAnsi" w:cstheme="majorHAnsi"/>
-        </w:rPr>
-        <w:t xml:space="preserve"> as a validate </w:t>
-      </w:r>
-      <w:r>
-        <w:rPr>
-          <w:rFonts w:asciiTheme="majorHAnsi" w:hAnsiTheme="majorHAnsi" w:cstheme="majorHAnsi"/>
-        </w:rPr>
-        <w:t>engine</w:t>
-      </w:r>
-      <w:r>
-        <w:rPr>
-          <w:rFonts w:asciiTheme="majorHAnsi" w:hAnsiTheme="majorHAnsi" w:cstheme="majorHAnsi"/>
-        </w:rPr>
-        <w:t xml:space="preserve">,  </w:t>
-      </w:r>
-      <w:r>
-        <w:rPr>
-          <w:rFonts w:asciiTheme="majorHAnsi" w:hAnsiTheme="majorHAnsi" w:cstheme="majorHAnsi"/>
-        </w:rPr>
-        <w:t>it de-queues the message packet,</w:t>
-      </w:r>
-      <w:r>
-        <w:rPr>
-          <w:rFonts w:asciiTheme="majorHAnsi" w:hAnsiTheme="majorHAnsi" w:cstheme="majorHAnsi"/>
-        </w:rPr>
-        <w:t xml:space="preserve"> </w:t>
-      </w:r>
-      <w:r>
-        <w:rPr>
-          <w:rFonts w:asciiTheme="majorHAnsi" w:hAnsiTheme="majorHAnsi" w:cstheme="majorHAnsi"/>
-        </w:rPr>
-        <w:t xml:space="preserve"> extract the raw data and </w:t>
-      </w:r>
-      <w:r>
-        <w:rPr>
-          <w:rFonts w:asciiTheme="majorHAnsi" w:hAnsiTheme="majorHAnsi" w:cstheme="majorHAnsi"/>
-        </w:rPr>
-        <w:t>perform validation and set event signal based on the processed output.</w:t>
-      </w:r>
-    </w:p>
-    <w:p>
-      <w:pPr>
-        <w:pStyle w:val="ListParagraph"/>
-        <w:numPr>
-          <w:ilvl w:val="0"/>
-          <w:numId w:val="15"/>
-        </w:numPr>
-        <w:rPr>
-          <w:rFonts w:asciiTheme="majorHAnsi" w:hAnsiTheme="majorHAnsi" w:cstheme="majorHAnsi"/>
-        </w:rPr>
-      </w:pPr>
-      <w:r>
-        <w:rPr>
-          <w:rFonts w:asciiTheme="majorHAnsi" w:hAnsiTheme="majorHAnsi" w:cstheme="majorHAnsi"/>
-        </w:rPr>
-        <w:t>Declared and initialize a</w:t>
-      </w:r>
-      <w:r>
-        <w:rPr>
-          <w:rFonts w:asciiTheme="majorHAnsi" w:hAnsiTheme="majorHAnsi" w:cstheme="majorHAnsi"/>
-        </w:rPr>
-        <w:t>n</w:t>
-      </w:r>
-      <w:r>
-        <w:rPr>
-          <w:rFonts w:asciiTheme="majorHAnsi" w:hAnsiTheme="majorHAnsi" w:cstheme="majorHAnsi"/>
-        </w:rPr>
-        <w:t xml:space="preserve"> unsigned integer variable  </w:t>
-      </w:r>
-      <w:r>
-        <w:rPr>
-          <w:i/>
-          <w:iCs/>
-        </w:rPr>
-        <w:t>[uint32_t ulAltitudeData].</w:t>
-      </w:r>
-    </w:p>
-    <w:p>
-      <w:pPr>
-        <w:pStyle w:val="ListParagraph"/>
-        <w:numPr>
-          <w:ilvl w:val="0"/>
-          <w:numId w:val="15"/>
-        </w:numPr>
-        <w:rPr>
-          <w:rFonts w:asciiTheme="majorHAnsi" w:hAnsiTheme="majorHAnsi" w:cstheme="majorHAnsi"/>
-        </w:rPr>
-      </w:pPr>
-      <w:r>
-        <w:rPr>
-          <w:rFonts w:asciiTheme="majorHAnsi" w:hAnsiTheme="majorHAnsi" w:cstheme="majorHAnsi"/>
-        </w:rPr>
-        <w:t>Listen to message queue for the data arrival.</w:t>
-      </w:r>
-    </w:p>
-    <w:p>
-      <w:pPr>
-        <w:pStyle w:val="ListParagraph"/>
-        <w:numPr>
-          <w:ilvl w:val="0"/>
-          <w:numId w:val="15"/>
-        </w:numPr>
-        <w:rPr>
-          <w:i/>
-          <w:iCs/>
-        </w:rPr>
-      </w:pPr>
-      <w:r>
-        <w:rPr>
-          <w:rFonts w:asciiTheme="majorHAnsi" w:hAnsiTheme="majorHAnsi" w:cstheme="majorHAnsi"/>
-        </w:rPr>
-        <w:t>extract</w:t>
-      </w:r>
-      <w:r>
-        <w:rPr>
-          <w:rFonts w:asciiTheme="majorHAnsi" w:hAnsiTheme="majorHAnsi" w:cstheme="majorHAnsi"/>
-        </w:rPr>
-        <w:t xml:space="preserve"> the altitude value from the message packet and assigned to </w:t>
-      </w:r>
-      <w:r>
-        <w:rPr>
-          <w:i/>
-          <w:iCs/>
-        </w:rPr>
-        <w:t>[uint32_t ulAltitudeData].</w:t>
-      </w:r>
-    </w:p>
-    <w:p>
-      <w:pPr>
-        <w:pStyle w:val="ListParagraph"/>
-        <w:numPr>
-          <w:ilvl w:val="0"/>
-          <w:numId w:val="15"/>
-        </w:numPr>
-        <w:rPr>
-          <w:rFonts w:asciiTheme="majorHAnsi" w:hAnsiTheme="majorHAnsi" w:cstheme="majorHAnsi"/>
-        </w:rPr>
-      </w:pPr>
-      <w:r>
-        <w:rPr>
-          <w:rFonts w:asciiTheme="majorHAnsi" w:hAnsiTheme="majorHAnsi" w:cstheme="majorHAnsi"/>
-        </w:rPr>
-        <w:t>Pass [</w:t>
-      </w:r>
-      <w:r>
-        <w:rPr>
-          <w:i/>
-          <w:iCs/>
-        </w:rPr>
-        <w:t>ulAltitudeData</w:t>
-      </w:r>
-      <w:r>
-        <w:rPr>
-          <w:i/>
-          <w:iCs/>
-        </w:rPr>
-        <w:t xml:space="preserve"> ]</w:t>
-      </w:r>
-      <w:r>
-        <w:rPr>
-          <w:rFonts w:asciiTheme="majorHAnsi" w:hAnsiTheme="majorHAnsi" w:cstheme="majorHAnsi"/>
-        </w:rPr>
-        <w:t xml:space="preserve"> </w:t>
-      </w:r>
-      <w:r>
-        <w:rPr>
-          <w:rFonts w:asciiTheme="majorHAnsi" w:hAnsiTheme="majorHAnsi" w:cstheme="majorHAnsi"/>
-        </w:rPr>
-        <w:t xml:space="preserve"> to </w:t>
-      </w:r>
-      <w:r>
-        <w:rPr>
-          <w:rFonts w:asciiTheme="majorHAnsi" w:hAnsiTheme="majorHAnsi" w:cstheme="majorHAnsi"/>
-        </w:rPr>
-        <w:t xml:space="preserve">ProcessValidateAlititude() . </w:t>
-      </w:r>
-    </w:p>
-    <w:p>
-      <w:pPr>
-        <w:pStyle w:val="ListParagraph"/>
-        <w:numPr>
-          <w:ilvl w:val="0"/>
-          <w:numId w:val="15"/>
-        </w:numPr>
-        <w:rPr>
-          <w:rFonts w:asciiTheme="majorHAnsi" w:hAnsiTheme="majorHAnsi" w:cstheme="majorHAnsi"/>
-        </w:rPr>
-      </w:pPr>
-      <w:r>
-        <w:t xml:space="preserve">If the </w:t>
-      </w:r>
-      <w:r>
-        <w:t xml:space="preserve"> return value is 1 set </w:t>
-      </w:r>
-      <w:r>
-        <w:t>an</w:t>
-      </w:r>
-      <w:r>
-        <w:t xml:space="preserve"> event bit .</w:t>
-      </w:r>
-    </w:p>
-    <w:p>
-      <w:pPr>
-        <w:rPr>
-          <w:rFonts w:asciiTheme="majorHAnsi" w:hAnsiTheme="majorHAnsi" w:cstheme="majorHAnsi"/>
-        </w:rPr>
-      </w:pPr>
-    </w:p>
-    <w:p>
-      <w:pPr>
-        <w:rPr>
-          <w:rFonts w:asciiTheme="majorHAnsi" w:hAnsiTheme="majorHAnsi" w:cstheme="majorHAnsi"/>
-        </w:rPr>
-      </w:pPr>
-      <w:r>
-        <w:rPr>
-          <w:rFonts w:asciiTheme="majorHAnsi" w:hAnsiTheme="majorHAnsi" w:cstheme="majorHAnsi"/>
-        </w:rPr>
-        <w:t>2.2.2</w:t>
-      </w:r>
-      <w:r>
-        <w:rPr>
-          <w:rFonts w:asciiTheme="majorHAnsi" w:hAnsiTheme="majorHAnsi" w:cstheme="majorHAnsi"/>
-        </w:rPr>
-        <w:t xml:space="preserve"> </w:t>
-      </w:r>
-      <w:r>
-        <w:rPr>
-          <w:rFonts w:asciiTheme="majorHAnsi" w:hAnsiTheme="majorHAnsi" w:cstheme="majorHAnsi"/>
-        </w:rPr>
-        <w:t>ProcessValidateAlititude</w:t>
-      </w:r>
-      <w:r>
-        <w:rPr>
-          <w:rFonts w:asciiTheme="majorHAnsi" w:hAnsiTheme="majorHAnsi" w:cstheme="majorHAnsi"/>
-        </w:rPr>
-        <w:t>()</w:t>
-      </w:r>
-    </w:p>
-    <w:p>
-      <w:r>
-        <w:rPr>
-          <w:rFonts w:asciiTheme="majorHAnsi" w:hAnsiTheme="majorHAnsi" w:cstheme="majorHAnsi"/>
-        </w:rPr>
-        <w:t xml:space="preserve">This will check the altitude value we pass with  </w:t>
-      </w:r>
-      <w:r>
-        <w:rPr>
-          <w:i/>
-          <w:iCs/>
-        </w:rPr>
-        <w:t>[THRESHOLD_MIN, THRESHOLD_MAX].</w:t>
-      </w:r>
-      <w:r>
-        <w:t>Return value as per the conditions.</w:t>
-      </w:r>
-    </w:p>
-    <w:p>
-      <w:pPr>
-        <w:pStyle w:val="ListParagraph"/>
-        <w:numPr>
-          <w:ilvl w:val="0"/>
-          <w:numId w:val="16"/>
-        </w:numPr>
-      </w:pPr>
-      <w:r>
-        <w:t xml:space="preserve">Declare and initialize a Boolean variable </w:t>
-      </w:r>
-      <w:r>
-        <w:t>[blGetAlarm] false.</w:t>
-      </w:r>
-    </w:p>
-    <w:p>
-      <w:pPr>
-        <w:pStyle w:val="ListParagraph"/>
-        <w:numPr>
-          <w:ilvl w:val="0"/>
-          <w:numId w:val="16"/>
-        </w:numPr>
-        <w:rPr>
-          <w:rFonts w:asciiTheme="majorHAnsi" w:hAnsiTheme="majorHAnsi" w:cstheme="majorHAnsi"/>
-        </w:rPr>
-      </w:pPr>
-      <w:r>
-        <w:t xml:space="preserve">Verify </w:t>
-      </w:r>
-      <w:r>
-        <w:t xml:space="preserve"> [</w:t>
-      </w:r>
-      <w:r>
-        <w:rPr>
-          <w:i/>
-          <w:iCs/>
-        </w:rPr>
-        <w:t>ulAltitudeData</w:t>
-      </w:r>
-      <w:r>
-        <w:t xml:space="preserve">] </w:t>
-      </w:r>
-      <w:r>
-        <w:t xml:space="preserve">between </w:t>
-      </w:r>
-      <w:r>
-        <w:rPr>
-          <w:rFonts w:asciiTheme="majorHAnsi" w:hAnsiTheme="majorHAnsi" w:cstheme="majorHAnsi"/>
-        </w:rPr>
-        <w:t xml:space="preserve"> [</w:t>
-      </w:r>
-      <w:r>
-        <w:rPr>
-          <w:rFonts w:asciiTheme="majorHAnsi" w:hAnsiTheme="majorHAnsi" w:cstheme="majorHAnsi"/>
-          <w:i/>
-          <w:iCs/>
-        </w:rPr>
-        <w:t>MIN_RANGE</w:t>
-      </w:r>
-      <w:r>
-        <w:rPr>
-          <w:rFonts w:asciiTheme="majorHAnsi" w:hAnsiTheme="majorHAnsi" w:cstheme="majorHAnsi"/>
-          <w:i/>
-          <w:iCs/>
-        </w:rPr>
-        <w:t>]</w:t>
-      </w:r>
-      <w:r>
-        <w:rPr>
-          <w:rFonts w:asciiTheme="majorHAnsi" w:hAnsiTheme="majorHAnsi" w:cstheme="majorHAnsi"/>
-          <w:i/>
-          <w:iCs/>
-        </w:rPr>
-        <w:t xml:space="preserve"> </w:t>
-      </w:r>
-      <w:r>
-        <w:rPr>
-          <w:rFonts w:asciiTheme="majorHAnsi" w:hAnsiTheme="majorHAnsi" w:cstheme="majorHAnsi"/>
-          <w:i/>
-          <w:iCs/>
-        </w:rPr>
-        <w:t>and [</w:t>
-      </w:r>
-      <w:r>
-        <w:rPr>
-          <w:rFonts w:asciiTheme="majorHAnsi" w:hAnsiTheme="majorHAnsi" w:cstheme="majorHAnsi"/>
-          <w:i/>
-          <w:iCs/>
-        </w:rPr>
-        <w:t xml:space="preserve"> MAX RANGE]</w:t>
-      </w:r>
-      <w:r>
-        <w:rPr>
-          <w:rFonts w:asciiTheme="majorHAnsi" w:hAnsiTheme="majorHAnsi" w:cstheme="majorHAnsi"/>
-          <w:i/>
-          <w:iCs/>
-        </w:rPr>
-        <w:t>.</w:t>
-      </w:r>
-      <w:r>
-        <w:rPr>
-          <w:rFonts w:asciiTheme="majorHAnsi" w:hAnsiTheme="majorHAnsi" w:cstheme="majorHAnsi"/>
-          <w:i/>
-          <w:iCs/>
-        </w:rPr>
-        <w:t xml:space="preserve"> </w:t>
-      </w:r>
-      <w:r>
-        <w:rPr>
-          <w:rFonts w:asciiTheme="majorHAnsi" w:hAnsiTheme="majorHAnsi" w:cstheme="majorHAnsi"/>
-        </w:rPr>
-        <w:t xml:space="preserve">This </w:t>
-      </w:r>
-      <w:r>
-        <w:rPr>
-          <w:rFonts w:asciiTheme="majorHAnsi" w:hAnsiTheme="majorHAnsi" w:cstheme="majorHAnsi"/>
-        </w:rPr>
-        <w:t>ensures</w:t>
-      </w:r>
-      <w:r>
-        <w:rPr>
-          <w:rFonts w:asciiTheme="majorHAnsi" w:hAnsiTheme="majorHAnsi" w:cstheme="majorHAnsi"/>
-        </w:rPr>
-        <w:t xml:space="preserve"> there is no garbage value.</w:t>
-      </w:r>
-    </w:p>
-    <w:p>
-      <w:pPr>
-        <w:pStyle w:val="ListParagraph"/>
-        <w:numPr>
-          <w:ilvl w:val="0"/>
-          <w:numId w:val="16"/>
-        </w:numPr>
-      </w:pPr>
-      <w:r>
-        <w:rPr>
-          <w:rFonts w:asciiTheme="majorHAnsi" w:hAnsiTheme="majorHAnsi" w:cstheme="majorHAnsi"/>
-        </w:rPr>
-        <w:t xml:space="preserve">If </w:t>
-      </w:r>
-      <w:r>
-        <w:rPr>
-          <w:rFonts w:asciiTheme="majorHAnsi" w:hAnsiTheme="majorHAnsi" w:cstheme="majorHAnsi"/>
-        </w:rPr>
-        <w:t>data is sane,</w:t>
-      </w:r>
-      <w:r>
-        <w:rPr>
-          <w:rFonts w:asciiTheme="majorHAnsi" w:hAnsiTheme="majorHAnsi" w:cstheme="majorHAnsi"/>
-        </w:rPr>
-        <w:t xml:space="preserve"> check </w:t>
-      </w:r>
-      <w:r>
-        <w:rPr>
-          <w:rFonts w:asciiTheme="majorHAnsi" w:hAnsiTheme="majorHAnsi" w:cstheme="majorHAnsi"/>
-        </w:rPr>
-        <w:t>with [</w:t>
-      </w:r>
-      <w:r>
-        <w:rPr>
-          <w:i/>
-          <w:iCs/>
-        </w:rPr>
-        <w:t>THRESHOLD_MIN, THRESHOLD_MAX</w:t>
-      </w:r>
-      <w:r>
-        <w:rPr>
-          <w:i/>
-          <w:iCs/>
-        </w:rPr>
-        <w:t>].</w:t>
-      </w:r>
-    </w:p>
-    <w:p>
-      <w:pPr>
-        <w:pStyle w:val="ListParagraph"/>
-        <w:numPr>
-          <w:ilvl w:val="0"/>
-          <w:numId w:val="16"/>
-        </w:numPr>
-      </w:pPr>
-      <w:r>
-        <w:t xml:space="preserve">If value is outside the threshold set </w:t>
-      </w:r>
-      <w:r>
-        <w:t>blGetAlarm</w:t>
-      </w:r>
-      <w:r>
-        <w:t xml:space="preserve"> true.</w:t>
-      </w:r>
-    </w:p>
-    <w:p>
-      <w:pPr>
-        <w:pStyle w:val="ListParagraph"/>
-        <w:numPr>
-          <w:ilvl w:val="0"/>
-          <w:numId w:val="16"/>
-        </w:numPr>
-        <w:rPr>
-          <w:rFonts w:asciiTheme="majorHAnsi" w:hAnsiTheme="majorHAnsi" w:cstheme="majorHAnsi"/>
-        </w:rPr>
-      </w:pPr>
-      <w:r>
-        <w:t xml:space="preserve">Return </w:t>
-      </w:r>
-      <w:r>
-        <w:t>blGetAlarm</w:t>
-      </w:r>
-      <w:r>
-        <w:t>.</w:t>
-      </w:r>
-    </w:p>
-    <w:p>
-      <w:pPr>
-        <w:pStyle w:val="Heading3"/>
-      </w:pPr>
-      <w:r>
-        <w:t>2.3 Alarm Management</w:t>
-      </w:r>
-    </w:p>
-    <w:p>
-      <w:pPr>
-        <w:rPr>
-          <w:rFonts w:asciiTheme="majorHAnsi" w:hAnsiTheme="majorHAnsi" w:cstheme="majorHAnsi"/>
-        </w:rPr>
-      </w:pPr>
-      <w:r>
-        <w:rPr>
-          <w:rFonts w:asciiTheme="majorHAnsi" w:hAnsiTheme="majorHAnsi" w:cstheme="majorHAnsi"/>
-        </w:rPr>
-        <w:t xml:space="preserve">Monitors the </w:t>
-      </w:r>
-      <w:r>
-        <w:rPr>
-          <w:rFonts w:asciiTheme="majorHAnsi" w:hAnsiTheme="majorHAnsi" w:cstheme="majorHAnsi"/>
-        </w:rPr>
-        <w:t>event system</w:t>
-      </w:r>
-      <w:r>
-        <w:rPr>
-          <w:rFonts w:asciiTheme="majorHAnsi" w:hAnsiTheme="majorHAnsi" w:cstheme="majorHAnsi"/>
-        </w:rPr>
-        <w:t xml:space="preserve"> group and manages alarm triggering</w:t>
-      </w:r>
-      <w:r>
-        <w:rPr>
-          <w:rFonts w:asciiTheme="majorHAnsi" w:hAnsiTheme="majorHAnsi" w:cstheme="majorHAnsi"/>
-        </w:rPr>
-        <w:t>.</w:t>
-      </w:r>
-    </w:p>
-    <w:p>
-      <w:pPr>
-        <w:rPr>
-          <w:rFonts w:asciiTheme="majorHAnsi" w:hAnsiTheme="majorHAnsi" w:cstheme="majorHAnsi"/>
-        </w:rPr>
-      </w:pPr>
-      <w:r>
-        <w:rPr>
-          <w:rFonts w:asciiTheme="majorHAnsi" w:hAnsiTheme="majorHAnsi" w:cstheme="majorHAnsi"/>
-        </w:rPr>
-        <w:t xml:space="preserve">2.3.1 </w:t>
-      </w:r>
-      <w:r>
-        <w:rPr>
-          <w:rFonts w:asciiTheme="majorHAnsi" w:hAnsiTheme="majorHAnsi" w:cstheme="majorHAnsi"/>
-        </w:rPr>
-        <w:t>AlarmInfoProcessHandler</w:t>
-      </w:r>
-      <w:r>
-        <w:rPr>
-          <w:rFonts w:asciiTheme="majorHAnsi" w:hAnsiTheme="majorHAnsi" w:cstheme="majorHAnsi"/>
-        </w:rPr>
-        <w:t>()</w:t>
-      </w:r>
-    </w:p>
-    <w:p>
-      <w:pPr>
-        <w:pStyle w:val="ListParagraph"/>
-        <w:numPr>
-          <w:ilvl w:val="0"/>
-          <w:numId w:val="17"/>
-        </w:numPr>
-        <w:rPr>
-          <w:rFonts w:asciiTheme="majorHAnsi" w:hAnsiTheme="majorHAnsi" w:cstheme="majorHAnsi"/>
-        </w:rPr>
-      </w:pPr>
-      <w:r>
-        <w:rPr>
-          <w:rFonts w:asciiTheme="majorHAnsi" w:hAnsiTheme="majorHAnsi" w:cstheme="majorHAnsi"/>
-        </w:rPr>
-        <w:t>Check the status of [EVENT_SET_ALARM] BIT.</w:t>
-      </w:r>
-    </w:p>
-    <w:p>
-      <w:pPr>
-        <w:pStyle w:val="ListParagraph"/>
-        <w:numPr>
-          <w:ilvl w:val="0"/>
-          <w:numId w:val="17"/>
-        </w:numPr>
-        <w:rPr>
-          <w:rFonts w:asciiTheme="majorHAnsi" w:hAnsiTheme="majorHAnsi" w:cstheme="majorHAnsi"/>
-        </w:rPr>
-      </w:pPr>
-      <w:r>
-        <w:rPr>
-          <w:rFonts w:asciiTheme="majorHAnsi" w:hAnsiTheme="majorHAnsi" w:cstheme="majorHAnsi"/>
-        </w:rPr>
-        <w:t xml:space="preserve">If </w:t>
-      </w:r>
-      <w:r>
-        <w:rPr>
-          <w:rFonts w:asciiTheme="majorHAnsi" w:hAnsiTheme="majorHAnsi" w:cstheme="majorHAnsi"/>
-        </w:rPr>
-        <w:t>[EVENT_SET_ALARM]</w:t>
-      </w:r>
-      <w:r>
-        <w:rPr>
-          <w:rFonts w:asciiTheme="majorHAnsi" w:hAnsiTheme="majorHAnsi" w:cstheme="majorHAnsi"/>
-        </w:rPr>
-        <w:t xml:space="preserve"> is high </w:t>
-      </w:r>
-      <w:r>
-        <w:rPr>
-          <w:rFonts w:asciiTheme="majorHAnsi" w:hAnsiTheme="majorHAnsi" w:cstheme="majorHAnsi"/>
-        </w:rPr>
-        <w:t xml:space="preserve">, </w:t>
-      </w:r>
-      <w:r>
-        <w:rPr>
-          <w:rFonts w:asciiTheme="majorHAnsi" w:hAnsiTheme="majorHAnsi" w:cstheme="majorHAnsi"/>
-        </w:rPr>
-        <w:t>trigger alarm up to [ALARM_TIMEOUT].</w:t>
-      </w:r>
-    </w:p>
-    <w:p>
-      <w:pPr>
-        <w:pStyle w:val="Heading2"/>
-      </w:pPr>
-      <w:r>
-        <w:t>3. Detailed Function Descriptions</w:t>
-      </w:r>
-    </w:p>
-    <w:p>
-      <w:pPr>
-        <w:pStyle w:val="Heading3"/>
-      </w:pPr>
-      <w:r>
-        <w:t>3.1.Function Prototypes</w:t>
-      </w:r>
-    </w:p>
-    <w:p>
-      <w:r>
-        <w:t xml:space="preserve">This module </w:t>
-      </w:r>
-      <w:r>
-        <w:t>describes</w:t>
-      </w:r>
-      <w:r>
-        <w:t xml:space="preserve"> the prototypes of </w:t>
-      </w:r>
-      <w:r>
-        <w:t>above-mentioned</w:t>
-      </w:r>
-      <w:r>
-        <w:t xml:space="preserve"> functions.</w:t>
+        <w:t>)</w:t>
       </w:r>
     </w:p>
     <w:p>
@@ -1369,23 +451,10 @@
         </w:numPr>
       </w:pPr>
       <w:r>
-        <w:t xml:space="preserve">bool </w:t>
-      </w:r>
-      <w:r>
-        <w:t>SensorInitialization</w:t>
-      </w:r>
-      <w:r>
-        <w:t>(</w:t>
-      </w:r>
-      <w:r>
-        <w:rPr>
-          <w:i/>
-          <w:iCs/>
-        </w:rPr>
-        <w:t>uint32_t ulFrequency</w:t>
-      </w:r>
-      <w:r>
-        <w:t>)</w:t>
+        <w:t>void SensorAltitudeMeasure(void)</w:t>
+      </w:r>
+      <w:r>
+        <w:t>;</w:t>
       </w:r>
     </w:p>
     <w:p>
@@ -1397,16 +466,13 @@
         </w:numPr>
       </w:pPr>
       <w:r>
-        <w:t xml:space="preserve">void </w:t>
-      </w:r>
-      <w:r>
-        <w:t>SensorAltitudeMeasure</w:t>
-      </w:r>
-      <w:r>
-        <w:t>(void)</w:t>
-      </w:r>
-      <w:r>
-        <w:t>;</w:t>
+        <w:t xml:space="preserve">void* </w:t>
+      </w:r>
+      <w:r>
+        <w:t>SensorReadHandler</w:t>
+      </w:r>
+      <w:r>
+        <w:t>(void* arg);</w:t>
       </w:r>
     </w:p>
     <w:p>
@@ -1418,34 +484,10 @@
         </w:numPr>
       </w:pPr>
       <w:r>
-        <w:t xml:space="preserve">void* </w:t>
-      </w:r>
-      <w:r>
-        <w:t>SensorReadHandler</w:t>
-      </w:r>
-      <w:r>
-        <w:t>(void* arg);</w:t>
-      </w:r>
-    </w:p>
-    <w:p>
-      <w:pPr>
-        <w:pStyle w:val="ListParagraph"/>
-        <w:numPr>
-          <w:ilvl w:val="0"/>
-          <w:numId w:val="20"/>
-        </w:numPr>
-      </w:pPr>
-      <w:r>
         <w:t xml:space="preserve">static </w:t>
       </w:r>
       <w:r>
-        <w:t xml:space="preserve">uint32_t </w:t>
-      </w:r>
-      <w:r>
-        <w:t>SensorDataRead</w:t>
-      </w:r>
-      <w:r>
-        <w:t>(void);</w:t>
+        <w:t>uint32_t SensorDataRead(void);</w:t>
       </w:r>
     </w:p>
     <w:p>
@@ -1463,19 +505,7 @@
         <w:rPr>
           <w:rFonts w:asciiTheme="majorHAnsi" w:hAnsiTheme="majorHAnsi" w:cstheme="majorHAnsi"/>
         </w:rPr>
-        <w:t xml:space="preserve">void* </w:t>
-      </w:r>
-      <w:r>
-        <w:rPr>
-          <w:rFonts w:asciiTheme="majorHAnsi" w:hAnsiTheme="majorHAnsi" w:cstheme="majorHAnsi"/>
-        </w:rPr>
-        <w:t>ProcessSensorData</w:t>
-      </w:r>
-      <w:r>
-        <w:rPr>
-          <w:rFonts w:asciiTheme="majorHAnsi" w:hAnsiTheme="majorHAnsi" w:cstheme="majorHAnsi"/>
-        </w:rPr>
-        <w:t>(void* arg)</w:t>
+        <w:t>void* ProcessSensorData(void* arg)</w:t>
       </w:r>
       <w:r>
         <w:rPr>
@@ -1502,13 +532,7 @@
         <w:rPr>
           <w:rFonts w:asciiTheme="majorHAnsi" w:hAnsiTheme="majorHAnsi" w:cstheme="majorHAnsi"/>
         </w:rPr>
-        <w:t xml:space="preserve">bool </w:t>
-      </w:r>
-      <w:r>
-        <w:rPr>
-          <w:rFonts w:asciiTheme="majorHAnsi" w:hAnsiTheme="majorHAnsi" w:cstheme="majorHAnsi"/>
-        </w:rPr>
-        <w:t>ProcessValidateAlititude</w:t>
+        <w:t>bool ProcessValidateAlititude</w:t>
       </w:r>
       <w:r>
         <w:rPr>
@@ -1542,109 +566,63 @@
         <w:rPr>
           <w:rFonts w:asciiTheme="majorHAnsi" w:hAnsiTheme="majorHAnsi" w:cstheme="majorHAnsi"/>
         </w:rPr>
-        <w:t xml:space="preserve">void* </w:t>
-      </w:r>
-      <w:r>
-        <w:rPr>
-          <w:rFonts w:asciiTheme="majorHAnsi" w:hAnsiTheme="majorHAnsi" w:cstheme="majorHAnsi"/>
-        </w:rPr>
-        <w:t>AlarmInfoProcessHandler</w:t>
-      </w:r>
-      <w:r>
-        <w:rPr>
-          <w:rFonts w:asciiTheme="majorHAnsi" w:hAnsiTheme="majorHAnsi" w:cstheme="majorHAnsi"/>
-        </w:rPr>
-        <w:t>(void* arg);</w:t>
-      </w:r>
-    </w:p>
-    <w:p/>
-    <w:p>
-      <w:pPr>
-        <w:pStyle w:val="Heading3"/>
-      </w:pPr>
-      <w:r>
-        <w:t>3.2 Function pseudocode</w:t>
+        <w:t>void* AlarmInfoProcessHandler(void* arg);</w:t>
       </w:r>
     </w:p>
     <w:p>
       <w:pPr>
-        <w:pStyle w:val="Heading4"/>
-      </w:pPr>
-      <w:r>
-        <w:t xml:space="preserve">3.2.1 </w:t>
-      </w:r>
-      <w:r>
-        <w:t>SensorInitialization</w:t>
-      </w:r>
-      <w:r>
-        <w:t>()</w:t>
+        <w:pStyle w:val="Heading3"/>
+      </w:pPr>
+      <w:r>
+        <w:t>3.2 Function pseudocode</w:t>
       </w:r>
     </w:p>
     <w:p>
-      <w:r>
-        <w:t xml:space="preserve">This will </w:t>
-      </w:r>
-      <w:r>
-        <w:t>be used</w:t>
-      </w:r>
-      <w:r>
-        <w:t xml:space="preserve"> to set frequency of sensor module.</w:t>
+      <w:pPr>
+        <w:pStyle w:val="Heading4"/>
+      </w:pPr>
+      <w:r>
+        <w:t>3.2.1 SensorInitialization()</w:t>
       </w:r>
     </w:p>
     <w:p>
-      <w:pPr>
-        <w:spacing w:after="0" w:line="240" w:lineRule="auto"/>
-      </w:pPr>
-      <w:r>
-        <w:t xml:space="preserve">FUNCTION </w:t>
-      </w:r>
-      <w:r>
-        <w:t xml:space="preserve"> SensorInitialization()</w:t>
+      <w:r>
+        <w:t xml:space="preserve">This will </w:t>
+      </w:r>
+      <w:r>
+        <w:t>be used</w:t>
+      </w:r>
+      <w:r>
+        <w:t xml:space="preserve"> to set frequency of sensor module.</w:t>
       </w:r>
     </w:p>
     <w:p>
       <w:pPr>
         <w:spacing w:after="0" w:line="240" w:lineRule="auto"/>
-        <w:ind w:firstLine="720"/>
-      </w:pPr>
-      <w:r>
-        <w:lastRenderedPageBreak/>
-        <w:t xml:space="preserve">DECALRE A BOOLEAN  VARIABLE </w:t>
-      </w:r>
-      <w:r>
-        <w:t xml:space="preserve">  blReturnSuccess </w:t>
-      </w:r>
-      <w:r>
-        <w:t>, SET AS FASLE</w:t>
-      </w:r>
-      <w:r>
-        <w:t>;</w:t>
+      </w:pPr>
+      <w:r>
+        <w:t xml:space="preserve">FUNCTION </w:t>
+      </w:r>
+      <w:r>
+        <w:t xml:space="preserve"> SensorInitialization()</w:t>
       </w:r>
     </w:p>
     <w:p>
       <w:pPr>
         <w:spacing w:after="0" w:line="240" w:lineRule="auto"/>
-      </w:pPr>
-      <w:r>
-        <w:t xml:space="preserve"> </w:t>
-      </w:r>
-      <w:r>
-        <w:tab/>
-      </w:r>
-      <w:r>
-        <w:t xml:space="preserve">CHECK </w:t>
-      </w:r>
-      <w:r>
-        <w:t>ulFrequency</w:t>
-      </w:r>
-      <w:r>
-        <w:t xml:space="preserve">   NOT EQUAL TO </w:t>
-      </w:r>
-      <w:r>
-        <w:t xml:space="preserve"> </w:t>
-      </w:r>
-      <w:r>
-        <w:t>ZERO</w:t>
+        <w:ind w:firstLine="720"/>
+      </w:pPr>
+      <w:r>
+        <w:t xml:space="preserve">DECALRE A BOOLEAN  VARIABLE </w:t>
+      </w:r>
+      <w:r>
+        <w:t xml:space="preserve">  blReturnSuccess </w:t>
+      </w:r>
+      <w:r>
+        <w:t>, SET AS FASLE</w:t>
+      </w:r>
+      <w:r>
+        <w:t>;</w:t>
       </w:r>
     </w:p>
     <w:p>
@@ -1652,146 +630,116 @@
         <w:spacing w:after="0" w:line="240" w:lineRule="auto"/>
       </w:pPr>
       <w:r>
+        <w:t xml:space="preserve"> </w:t>
+      </w:r>
+      <w:r>
         <w:tab/>
       </w:r>
       <w:r>
-        <w:tab/>
-      </w:r>
-      <w:r>
-        <w:t xml:space="preserve">ASSIGN </w:t>
-      </w:r>
-      <w:r>
-        <w:t>ulFrequency</w:t>
-      </w:r>
-      <w:r>
-        <w:t>[INPUT PARAMETER]</w:t>
-      </w:r>
-      <w:r>
-        <w:t xml:space="preserve">  TO </w:t>
+        <w:t xml:space="preserve">CHECK ulFrequency   NOT EQUAL TO </w:t>
       </w:r>
       <w:r>
         <w:t xml:space="preserve"> </w:t>
       </w:r>
       <w:r>
-        <w:t xml:space="preserve">MODULE </w:t>
-      </w:r>
-      <w:r>
-        <w:t xml:space="preserve"> </w:t>
-      </w:r>
-      <w:r>
-        <w:t>FREQUENCY</w:t>
+        <w:t>ZERO</w:t>
       </w:r>
     </w:p>
     <w:p>
       <w:pPr>
         <w:spacing w:after="0" w:line="240" w:lineRule="auto"/>
-        <w:ind w:left="720" w:firstLine="720"/>
-      </w:pPr>
-      <w:r>
-        <w:t xml:space="preserve">SET BOOLEAN </w:t>
-      </w:r>
-      <w:r>
-        <w:t xml:space="preserve">blReturnSuccess </w:t>
-      </w:r>
-      <w:r>
-        <w:t xml:space="preserve">AS </w:t>
-      </w:r>
-      <w:r>
-        <w:t xml:space="preserve"> true;</w:t>
+      </w:pPr>
+      <w:r>
+        <w:tab/>
+      </w:r>
+      <w:r>
+        <w:tab/>
+      </w:r>
+      <w:r>
+        <w:t>ASSIGN ulFrequency</w:t>
+      </w:r>
+      <w:r>
+        <w:t>[INPUT PARAMETER]</w:t>
+      </w:r>
+      <w:r>
+        <w:t xml:space="preserve">  TO </w:t>
+      </w:r>
+      <w:r>
+        <w:t xml:space="preserve"> </w:t>
+      </w:r>
+      <w:r>
+        <w:t xml:space="preserve">MODULE </w:t>
+      </w:r>
+      <w:r>
+        <w:t xml:space="preserve"> </w:t>
+      </w:r>
+      <w:r>
+        <w:t>FREQUENCY</w:t>
       </w:r>
     </w:p>
     <w:p>
       <w:pPr>
         <w:spacing w:after="0" w:line="240" w:lineRule="auto"/>
-        <w:ind w:firstLine="720"/>
-      </w:pPr>
-      <w:r>
-        <w:t xml:space="preserve">RETURN BOOLEAN </w:t>
-      </w:r>
-      <w:r>
-        <w:t xml:space="preserve"> blReturnSuccess;</w:t>
+        <w:ind w:left="720" w:firstLine="720"/>
+      </w:pPr>
+      <w:r>
+        <w:t xml:space="preserve">SET BOOLEAN </w:t>
+      </w:r>
+      <w:r>
+        <w:t xml:space="preserve">blReturnSuccess </w:t>
+      </w:r>
+      <w:r>
+        <w:t xml:space="preserve">AS </w:t>
+      </w:r>
+      <w:r>
+        <w:t xml:space="preserve"> true;</w:t>
       </w:r>
     </w:p>
     <w:p>
       <w:pPr>
         <w:spacing w:after="0" w:line="240" w:lineRule="auto"/>
-      </w:pPr>
+        <w:ind w:firstLine="720"/>
+      </w:pPr>
+      <w:r>
+        <w:t xml:space="preserve">RETURN BOOLEAN </w:t>
+      </w:r>
+      <w:r>
+        <w:t xml:space="preserve"> blReturnSuccess;</w:t>
+      </w:r>
     </w:p>
     <w:p>
       <w:pPr>
-        <w:pStyle w:val="Heading4"/>
-      </w:pPr>
-      <w:r>
-        <w:t>3.2.1 SensorAltitudeMeasure</w:t>
-      </w:r>
-      <w:r>
-        <w:t xml:space="preserve"> </w:t>
-      </w:r>
-      <w:r>
-        <w:t>(</w:t>
-      </w:r>
-      <w:r>
-        <w:t>)</w:t>
-      </w:r>
+        <w:spacing w:after="0" w:line="240" w:lineRule="auto"/>
+      </w:pPr>
     </w:p>
     <w:p>
-      <w:r>
-        <w:t xml:space="preserve">   Key entry point which called from main()</w:t>
+      <w:pPr>
+        <w:pStyle w:val="Heading4"/>
+      </w:pPr>
+      <w:r>
+        <w:t>3.2.1 SensorAltitudeMeasure ()</w:t>
       </w:r>
     </w:p>
     <w:p>
-      <w:pPr>
-        <w:spacing w:after="0"/>
-      </w:pPr>
-      <w:r>
-        <w:t>FUNCTION</w:t>
-      </w:r>
-      <w:r>
-        <w:t xml:space="preserve"> SensorAltitudeMeasure()</w:t>
+      <w:r>
+        <w:t xml:space="preserve">   Key entry point which called from main()</w:t>
       </w:r>
     </w:p>
     <w:p>
       <w:pPr>
         <w:spacing w:after="0"/>
       </w:pPr>
+      <w:r>
+        <w:t>FUNCTION</w:t>
+      </w:r>
+      <w:r>
+        <w:t xml:space="preserve"> SensorAltitudeMeasure()</w:t>
+      </w:r>
     </w:p>
     <w:p>
       <w:pPr>
         <w:spacing w:after="0"/>
       </w:pPr>
-      <w:r>
-        <w:tab/>
-      </w:r>
-      <w:r>
-        <w:t>DECLARE</w:t>
-      </w:r>
-      <w:r>
-        <w:t xml:space="preserve"> MESSAGE_HANLDER</w:t>
-      </w:r>
-      <w:r>
-        <w:t>S</w:t>
-      </w:r>
-      <w:r>
-        <w:t>,</w:t>
-      </w:r>
-      <w:r>
-        <w:t xml:space="preserve"> </w:t>
-      </w:r>
-      <w:r>
-        <w:t>EVENT_HANDLER</w:t>
-      </w:r>
-      <w:r>
-        <w:t>,</w:t>
-      </w:r>
-      <w:r>
-        <w:t xml:space="preserve"> </w:t>
-      </w:r>
-      <w:r>
-        <w:t>thread1,thread2,thread3</w:t>
-      </w:r>
-      <w:r>
-        <w:t>;</w:t>
-      </w:r>
     </w:p>
     <w:p>
       <w:pPr>
@@ -1801,10 +749,34 @@
         <w:tab/>
       </w:r>
       <w:r>
-        <w:t>SET</w:t>
-      </w:r>
-      <w:r>
-        <w:t xml:space="preserve"> MSG_QUEUE_PARAMS;</w:t>
+        <w:t>DECLARE</w:t>
+      </w:r>
+      <w:r>
+        <w:t xml:space="preserve"> MESSAGE_HANLDER</w:t>
+      </w:r>
+      <w:r>
+        <w:t>S</w:t>
+      </w:r>
+      <w:r>
+        <w:t>,</w:t>
+      </w:r>
+      <w:r>
+        <w:t xml:space="preserve"> </w:t>
+      </w:r>
+      <w:r>
+        <w:t>EVENT_HANDLER</w:t>
+      </w:r>
+      <w:r>
+        <w:t>,</w:t>
+      </w:r>
+      <w:r>
+        <w:t xml:space="preserve"> </w:t>
+      </w:r>
+      <w:r>
+        <w:t>thread1,thread2,thread3</w:t>
+      </w:r>
+      <w:r>
+        <w:t>;</w:t>
       </w:r>
     </w:p>
     <w:p>
@@ -1815,10 +787,10 @@
         <w:tab/>
       </w:r>
       <w:r>
-        <w:t xml:space="preserve">SET </w:t>
-      </w:r>
-      <w:r>
-        <w:t>THREAD_PARAMS;</w:t>
+        <w:t>SET</w:t>
+      </w:r>
+      <w:r>
+        <w:t xml:space="preserve"> MSG_QUEUE_PARAMS;</w:t>
       </w:r>
     </w:p>
     <w:p>
@@ -1828,13 +800,19 @@
       <w:r>
         <w:tab/>
       </w:r>
+      <w:r>
+        <w:t xml:space="preserve">SET </w:t>
+      </w:r>
+      <w:r>
+        <w:t>THREAD_PARAMS;</w:t>
+      </w:r>
     </w:p>
     <w:p>
       <w:pPr>
         <w:spacing w:after="0"/>
       </w:pPr>
       <w:r>
-        <w:t xml:space="preserve">              /*Message queue implementation*/</w:t>
+        <w:tab/>
       </w:r>
     </w:p>
     <w:p>
@@ -1842,16 +820,7 @@
         <w:spacing w:after="0"/>
       </w:pPr>
       <w:r>
-        <w:tab/>
-      </w:r>
-      <w:r>
-        <w:t>MESSAGE_HANLDER</w:t>
-      </w:r>
-      <w:r>
-        <w:t xml:space="preserve"> = </w:t>
-      </w:r>
-      <w:r>
-        <w:t>CREATE_MSG_QUEUE(MSG_QUEUE_PARAMS))</w:t>
+        <w:t xml:space="preserve">              /*Message queue implementation*/</w:t>
       </w:r>
     </w:p>
     <w:p>
@@ -1859,6 +828,87 @@
         <w:spacing w:after="0"/>
       </w:pPr>
       <w:r>
+        <w:lastRenderedPageBreak/>
+        <w:tab/>
+        <w:t>MESSAGE_HANLDER = CREATE_MSG_QUEUE(MSG_QUEUE_PARAMS))</w:t>
+      </w:r>
+    </w:p>
+    <w:p>
+      <w:pPr>
+        <w:spacing w:after="0"/>
+      </w:pPr>
+      <w:r>
+        <w:t xml:space="preserve"> </w:t>
+      </w:r>
+      <w:r>
+        <w:tab/>
+        <w:t>IF MESSAGE_HANLDER IS NOT VALID</w:t>
+      </w:r>
+    </w:p>
+    <w:p>
+      <w:pPr>
+        <w:spacing w:after="0"/>
+      </w:pPr>
+      <w:r>
+        <w:tab/>
+        <w:t xml:space="preserve">PRINT ERROR MESSAGE </w:t>
+      </w:r>
+    </w:p>
+    <w:p>
+      <w:pPr>
+        <w:spacing w:after="0"/>
+        <w:ind w:firstLine="720"/>
+      </w:pPr>
+      <w:r>
+        <w:t>RETURN</w:t>
+      </w:r>
+    </w:p>
+    <w:p>
+      <w:pPr>
+        <w:spacing w:after="0"/>
+        <w:ind w:firstLine="720"/>
+      </w:pPr>
+    </w:p>
+    <w:p>
+      <w:pPr>
+        <w:spacing w:after="0"/>
+        <w:ind w:firstLine="720"/>
+      </w:pPr>
+      <w:r>
+        <w:t>/*</w:t>
+      </w:r>
+      <w:r>
+        <w:t>Event handler</w:t>
+      </w:r>
+      <w:r>
+        <w:t xml:space="preserve"> implementation*/</w:t>
+      </w:r>
+    </w:p>
+    <w:p>
+      <w:pPr>
+        <w:spacing w:after="0"/>
+      </w:pPr>
+      <w:r>
+        <w:tab/>
+      </w:r>
+      <w:r>
+        <w:t xml:space="preserve">EVENT_HANDLER </w:t>
+      </w:r>
+      <w:r>
+        <w:t>= CREATE_</w:t>
+      </w:r>
+      <w:r>
+        <w:t>EVENT</w:t>
+      </w:r>
+      <w:r>
+        <w:t>())</w:t>
+      </w:r>
+    </w:p>
+    <w:p>
+      <w:pPr>
+        <w:spacing w:after="0"/>
+      </w:pPr>
+      <w:r>
         <w:t xml:space="preserve"> </w:t>
       </w:r>
       <w:r>
@@ -1866,10 +916,10 @@
         <w:t xml:space="preserve">IF </w:t>
       </w:r>
       <w:r>
-        <w:t>MESSAGE_HANLDER</w:t>
-      </w:r>
-      <w:r>
-        <w:t xml:space="preserve"> IS NOT VALID</w:t>
+        <w:t xml:space="preserve">EVENT_HANDLER </w:t>
+      </w:r>
+      <w:r>
+        <w:t>IS NOT VALID</w:t>
       </w:r>
     </w:p>
     <w:p>
@@ -1902,70 +952,59 @@
         <w:ind w:firstLine="720"/>
       </w:pPr>
       <w:r>
-        <w:t>/*</w:t>
-      </w:r>
-      <w:r>
-        <w:t>Event handler</w:t>
-      </w:r>
-      <w:r>
-        <w:t xml:space="preserve"> implementation*/</w:t>
+        <w:t>CREATE_THREAD(</w:t>
+      </w:r>
+      <w:r>
+        <w:t>thread1,</w:t>
+      </w:r>
+      <w:r>
+        <w:t>SensorReadHandler</w:t>
+      </w:r>
+      <w:r>
+        <w:t>);</w:t>
       </w:r>
     </w:p>
     <w:p>
       <w:pPr>
         <w:spacing w:after="0"/>
-      </w:pPr>
-      <w:r>
-        <w:tab/>
-      </w:r>
-      <w:r>
-        <w:t>EVE</w:t>
-      </w:r>
-      <w:r>
-        <w:t>N</w:t>
-      </w:r>
-      <w:r>
-        <w:t>T_HANDLER</w:t>
-      </w:r>
-      <w:r>
-        <w:t xml:space="preserve"> </w:t>
-      </w:r>
-      <w:r>
-        <w:t>= CREATE_</w:t>
-      </w:r>
-      <w:r>
-        <w:t>EVENT</w:t>
-      </w:r>
-      <w:r>
-        <w:t>())</w:t>
+        <w:ind w:firstLine="720"/>
+      </w:pPr>
+      <w:r>
+        <w:t>CREATE_THREAD(</w:t>
+      </w:r>
+      <w:r>
+        <w:t>thread2,</w:t>
+      </w:r>
+      <w:r>
+        <w:t>ProcessSensorData</w:t>
+      </w:r>
+      <w:r>
+        <w:t>);</w:t>
       </w:r>
     </w:p>
     <w:p>
       <w:pPr>
         <w:spacing w:after="0"/>
-      </w:pPr>
-      <w:r>
-        <w:t xml:space="preserve"> </w:t>
-      </w:r>
-      <w:r>
-        <w:tab/>
-        <w:t xml:space="preserve">IF </w:t>
-      </w:r>
-      <w:r>
-        <w:t xml:space="preserve">EVENT_HANDLER </w:t>
-      </w:r>
-      <w:r>
-        <w:t>IS NOT VALID</w:t>
+        <w:ind w:firstLine="720"/>
+      </w:pPr>
+      <w:r>
+        <w:t>CREATE_THREAD(</w:t>
+      </w:r>
+      <w:r>
+        <w:t>thread3,</w:t>
+      </w:r>
+      <w:r>
+        <w:t>AlarmInfoProcessHandler</w:t>
+      </w:r>
+      <w:r>
+        <w:t>);</w:t>
       </w:r>
     </w:p>
     <w:p>
       <w:pPr>
         <w:spacing w:after="0"/>
-      </w:pPr>
-      <w:r>
-        <w:tab/>
-        <w:t xml:space="preserve">PRINT ERROR MESSAGE </w:t>
-      </w:r>
+        <w:ind w:firstLine="720"/>
+      </w:pPr>
     </w:p>
     <w:p>
       <w:pPr>
@@ -1973,7 +1012,10 @@
         <w:ind w:firstLine="720"/>
       </w:pPr>
       <w:r>
-        <w:t>RETURN</w:t>
+        <w:t>IF</w:t>
+      </w:r>
+      <w:r>
+        <w:t xml:space="preserve"> thread1 AND thread2 AND thread3 ARE VALID</w:t>
       </w:r>
     </w:p>
     <w:p>
@@ -1981,131 +1023,475 @@
         <w:spacing w:after="0"/>
         <w:ind w:firstLine="720"/>
       </w:pPr>
+      <w:r>
+        <w:t xml:space="preserve">  </w:t>
+      </w:r>
+      <w:r>
+        <w:t xml:space="preserve"> </w:t>
+      </w:r>
+      <w:r>
+        <w:t xml:space="preserve">WAIT FOR THREAD TO EXECUTE </w:t>
+      </w:r>
+      <w:r>
+        <w:t>Its</w:t>
+      </w:r>
+      <w:r>
+        <w:t xml:space="preserve"> FUNCTION</w:t>
+      </w:r>
     </w:p>
     <w:p>
       <w:pPr>
         <w:spacing w:after="0"/>
-        <w:ind w:firstLine="720"/>
-      </w:pPr>
-      <w:r>
-        <w:t>CREATE_THREAD(</w:t>
-      </w:r>
-      <w:r>
-        <w:t>thread1</w:t>
-      </w:r>
-      <w:r>
-        <w:t>,</w:t>
-      </w:r>
-      <w:r>
-        <w:t>SensorReadHandler</w:t>
-      </w:r>
-      <w:r>
-        <w:t>)</w:t>
-      </w:r>
-      <w:r>
-        <w:t>;</w:t>
+      </w:pPr>
+      <w:r>
+        <w:t xml:space="preserve">    </w:t>
+      </w:r>
+      <w:r>
+        <w:tab/>
+      </w:r>
+      <w:r>
+        <w:t>ELSE</w:t>
       </w:r>
     </w:p>
     <w:p>
       <w:pPr>
         <w:spacing w:after="0"/>
-        <w:ind w:firstLine="720"/>
-      </w:pPr>
-      <w:r>
-        <w:t>CREATE_THREAD(</w:t>
-      </w:r>
-      <w:r>
-        <w:t>thread2</w:t>
-      </w:r>
-      <w:r>
-        <w:t>,</w:t>
-      </w:r>
-      <w:r>
-        <w:t>ProcessSensorData</w:t>
-      </w:r>
-      <w:r>
-        <w:t>);</w:t>
+      </w:pPr>
+      <w:r>
+        <w:tab/>
+        <w:t xml:space="preserve">  PRINT ERROR MESSAGE</w:t>
       </w:r>
     </w:p>
     <w:p>
       <w:pPr>
         <w:spacing w:after="0"/>
-        <w:ind w:firstLine="720"/>
-      </w:pPr>
-      <w:r>
-        <w:t>CREATE_THREAD(</w:t>
-      </w:r>
-      <w:r>
-        <w:t>thread3</w:t>
-      </w:r>
-      <w:r>
-        <w:t>,</w:t>
-      </w:r>
-      <w:r>
-        <w:t>A</w:t>
-      </w:r>
-      <w:r>
-        <w:t>larmInfoProcessHandler</w:t>
-      </w:r>
-      <w:r>
-        <w:t>);</w:t>
+      </w:pPr>
+      <w:r>
+        <w:tab/>
+        <w:t xml:space="preserve">  RETURN</w:t>
+      </w:r>
+      <w:r>
+        <w:tab/>
+        <w:t xml:space="preserve"> </w:t>
       </w:r>
     </w:p>
     <w:p>
       <w:pPr>
+        <w:pStyle w:val="Heading4"/>
+      </w:pPr>
+      <w:r>
+        <w:t>3.2.3 SensorReadHandler()</w:t>
+      </w:r>
+    </w:p>
+    <w:p>
+      <w:r>
+        <w:t xml:space="preserve"> </w:t>
+      </w:r>
+      <w:r>
+        <w:tab/>
+        <w:t>Manages the data flow of sensor module and message queue</w:t>
+      </w:r>
+    </w:p>
+    <w:p>
+      <w:pPr>
+        <w:spacing w:after="0" w:line="240" w:lineRule="auto"/>
+      </w:pPr>
+      <w:r>
+        <w:t>FUNCTION</w:t>
+      </w:r>
+      <w:r>
+        <w:t xml:space="preserve"> SensorReadHandler()</w:t>
+      </w:r>
+    </w:p>
+    <w:p>
+      <w:pPr>
+        <w:spacing w:after="0" w:line="240" w:lineRule="auto"/>
+      </w:pPr>
+    </w:p>
+    <w:p>
+      <w:pPr>
+        <w:spacing w:after="0" w:line="240" w:lineRule="auto"/>
+      </w:pPr>
+      <w:r>
+        <w:t xml:space="preserve">   </w:t>
+      </w:r>
+      <w:r>
+        <w:tab/>
+      </w:r>
+      <w:r>
+        <w:t xml:space="preserve">DECLARE STATIC UNSIGNED INTEGER VALUE </w:t>
+      </w:r>
+      <w:r>
+        <w:t xml:space="preserve">ulAltitudeValue </w:t>
+      </w:r>
+      <w:r>
+        <w:t>, SET AS ZERO</w:t>
+      </w:r>
+      <w:r>
+        <w:t>;</w:t>
+      </w:r>
+    </w:p>
+    <w:p>
+      <w:pPr>
+        <w:spacing w:after="0" w:line="240" w:lineRule="auto"/>
+      </w:pPr>
+      <w:r>
+        <w:t xml:space="preserve">    </w:t>
+      </w:r>
+      <w:r>
+        <w:tab/>
+      </w:r>
+      <w:r>
+        <w:t>DECLARE</w:t>
+      </w:r>
+      <w:r>
+        <w:t xml:space="preserve"> Timervariable</w:t>
+      </w:r>
+      <w:r>
+        <w:t xml:space="preserve"> AND ASSIGN</w:t>
+      </w:r>
+      <w:r>
+        <w:t xml:space="preserve"> TIME_INTERVAL;</w:t>
+      </w:r>
+    </w:p>
+    <w:p>
+      <w:pPr>
+        <w:spacing w:after="0" w:line="240" w:lineRule="auto"/>
+      </w:pPr>
+      <w:r>
+        <w:tab/>
+      </w:r>
+    </w:p>
+    <w:p>
+      <w:pPr>
+        <w:spacing w:after="0" w:line="240" w:lineRule="auto"/>
+      </w:pPr>
+      <w:r>
+        <w:tab/>
+      </w:r>
+      <w:r>
+        <w:t>DO IN A WHILE LOOP</w:t>
+      </w:r>
+    </w:p>
+    <w:p>
+      <w:pPr>
+        <w:spacing w:after="0" w:line="240" w:lineRule="auto"/>
+      </w:pPr>
+      <w:r>
+        <w:tab/>
+      </w:r>
+    </w:p>
+    <w:p>
+      <w:pPr>
+        <w:spacing w:after="0" w:line="240" w:lineRule="auto"/>
+      </w:pPr>
+      <w:r>
+        <w:tab/>
+      </w:r>
+      <w:r>
+        <w:tab/>
+      </w:r>
+      <w:r>
+        <w:t xml:space="preserve">WAIT  Timervariable  REACHES TO ZERO </w:t>
+      </w:r>
+    </w:p>
+    <w:p>
+      <w:pPr>
+        <w:spacing w:after="0" w:line="240" w:lineRule="auto"/>
+        <w:ind w:left="720" w:firstLine="720"/>
+      </w:pPr>
+      <w:r>
+        <w:t>USE</w:t>
+      </w:r>
+      <w:r>
+        <w:t xml:space="preserve"> </w:t>
+      </w:r>
+      <w:r>
+        <w:t xml:space="preserve">SensorDataRead() FUNCTION TO READ DATA AND ASSIGN TO         </w:t>
+      </w:r>
+      <w:r>
+        <w:t>ulAltitudeValue</w:t>
+      </w:r>
+    </w:p>
+    <w:p>
+      <w:pPr>
+        <w:spacing w:after="0" w:line="240" w:lineRule="auto"/>
+      </w:pPr>
+      <w:r>
+        <w:tab/>
+      </w:r>
+      <w:r>
+        <w:tab/>
+      </w:r>
+      <w:r>
+        <w:t xml:space="preserve">ASSIGN </w:t>
+      </w:r>
+      <w:r>
+        <w:t xml:space="preserve"> ulAltitudeValue </w:t>
+      </w:r>
+      <w:r>
+        <w:t xml:space="preserve">TO </w:t>
+      </w:r>
+      <w:r>
+        <w:t xml:space="preserve"> </w:t>
+      </w:r>
+      <w:r>
+        <w:t>MESSAGE_PACKET</w:t>
+      </w:r>
+      <w:r>
+        <w:t>;</w:t>
+      </w:r>
+    </w:p>
+    <w:p>
+      <w:pPr>
+        <w:spacing w:after="0" w:line="240" w:lineRule="auto"/>
+      </w:pPr>
+      <w:r>
+        <w:tab/>
+      </w:r>
+      <w:r>
+        <w:tab/>
+      </w:r>
+      <w:r>
+        <w:t>PUSH</w:t>
+      </w:r>
+      <w:r>
+        <w:t xml:space="preserve"> </w:t>
+      </w:r>
+      <w:r>
+        <w:t xml:space="preserve">MESSAGE_PACKET  TO </w:t>
+      </w:r>
+      <w:r>
+        <w:t xml:space="preserve"> </w:t>
+      </w:r>
+      <w:r>
+        <w:t>QUEUE</w:t>
+      </w:r>
+      <w:r>
+        <w:t>;</w:t>
+      </w:r>
+    </w:p>
+    <w:p>
+      <w:pPr>
+        <w:spacing w:after="0" w:line="240" w:lineRule="auto"/>
+      </w:pPr>
+      <w:r>
+        <w:tab/>
+      </w:r>
+      <w:r>
+        <w:tab/>
+      </w:r>
+      <w:r>
+        <w:t xml:space="preserve">RESET THE </w:t>
+      </w:r>
+      <w:r>
+        <w:t xml:space="preserve">Timervariable </w:t>
+      </w:r>
+      <w:r>
+        <w:t xml:space="preserve">BY </w:t>
+      </w:r>
+      <w:r>
+        <w:t xml:space="preserve"> TIME_INTERVAL;</w:t>
+      </w:r>
+    </w:p>
+    <w:p>
+      <w:pPr>
+        <w:spacing w:after="0" w:line="240" w:lineRule="auto"/>
+      </w:pPr>
+      <w:r>
+        <w:tab/>
+      </w:r>
+    </w:p>
+    <w:p>
+      <w:pPr>
+        <w:pStyle w:val="Heading4"/>
+      </w:pPr>
+      <w:r>
+        <w:t>3.2.4 SensorDataRead();</w:t>
+      </w:r>
+    </w:p>
+    <w:p>
+      <w:pPr>
+        <w:spacing w:after="0" w:line="240" w:lineRule="auto"/>
+      </w:pPr>
+      <w:r>
+        <w:t>Read data from sensor module</w:t>
+      </w:r>
+    </w:p>
+    <w:p>
+      <w:pPr>
+        <w:spacing w:after="0" w:line="240" w:lineRule="auto"/>
+      </w:pPr>
+    </w:p>
+    <w:p>
+      <w:pPr>
+        <w:spacing w:after="0" w:line="240" w:lineRule="auto"/>
+      </w:pPr>
+      <w:r>
+        <w:t>FUNCTION</w:t>
+      </w:r>
+      <w:r>
+        <w:t xml:space="preserve"> SensorDataRead(void)</w:t>
+      </w:r>
+    </w:p>
+    <w:p>
+      <w:pPr>
+        <w:spacing w:after="0" w:line="240" w:lineRule="auto"/>
+      </w:pPr>
+    </w:p>
+    <w:p>
+      <w:pPr>
+        <w:spacing w:after="0" w:line="240" w:lineRule="auto"/>
+      </w:pPr>
+      <w:r>
+        <w:tab/>
+        <w:t>DECLARE UNSIGNED INTEGER  ulAltitudeValue, SET AS ZERO;</w:t>
+      </w:r>
+    </w:p>
+    <w:p>
+      <w:pPr>
+        <w:spacing w:after="0" w:line="240" w:lineRule="auto"/>
+      </w:pPr>
+      <w:r>
+        <w:lastRenderedPageBreak/>
+        <w:tab/>
+      </w:r>
+    </w:p>
+    <w:p>
+      <w:pPr>
+        <w:spacing w:after="0" w:line="240" w:lineRule="auto"/>
+        <w:ind w:firstLine="720"/>
+      </w:pPr>
+      <w:r>
+        <w:t>READ DATA FROM SENSOR</w:t>
+      </w:r>
+    </w:p>
+    <w:p>
+      <w:pPr>
+        <w:spacing w:after="0" w:line="240" w:lineRule="auto"/>
+      </w:pPr>
+      <w:r>
+        <w:tab/>
+      </w:r>
+      <w:r>
+        <w:t xml:space="preserve">ASSIGN DATA </w:t>
+      </w:r>
+      <w:r>
+        <w:t xml:space="preserve"> </w:t>
+      </w:r>
+      <w:r>
+        <w:t xml:space="preserve">TO </w:t>
+      </w:r>
+      <w:r>
+        <w:t xml:space="preserve"> </w:t>
+      </w:r>
+      <w:r>
+        <w:t>ulAltitudeValue</w:t>
+      </w:r>
+    </w:p>
+    <w:p>
+      <w:pPr>
+        <w:spacing w:after="0" w:line="240" w:lineRule="auto"/>
+      </w:pPr>
+      <w:r>
+        <w:tab/>
+      </w:r>
+      <w:r>
+        <w:t>RETURN THE VARIABLE</w:t>
+      </w:r>
+      <w:r>
+        <w:t xml:space="preserve"> ulAltitudeValue</w:t>
+      </w:r>
+    </w:p>
+    <w:p>
+      <w:pPr>
+        <w:spacing w:after="0" w:line="240" w:lineRule="auto"/>
+      </w:pPr>
+    </w:p>
+    <w:p>
+      <w:pPr>
+        <w:pStyle w:val="Heading4"/>
+      </w:pPr>
+      <w:r>
+        <w:t>3.2.5</w:t>
+      </w:r>
+      <w:r>
+        <w:t xml:space="preserve"> </w:t>
+      </w:r>
+      <w:r>
+        <w:t xml:space="preserve">ProcessSensorData </w:t>
+      </w:r>
+    </w:p>
+    <w:p>
+      <w:pPr>
+        <w:spacing w:after="0" w:line="240" w:lineRule="auto"/>
+      </w:pPr>
+      <w:r>
+        <w:t>Deque the data , validate and set event flag</w:t>
+      </w:r>
+    </w:p>
+    <w:p>
+      <w:pPr>
+        <w:spacing w:after="0" w:line="240" w:lineRule="auto"/>
+      </w:pPr>
+    </w:p>
+    <w:p>
+      <w:pPr>
+        <w:spacing w:after="0"/>
+      </w:pPr>
+      <w:r>
+        <w:t xml:space="preserve">FUNCTION </w:t>
+      </w:r>
+      <w:r>
+        <w:t>ProcessSensorData(void* arg)</w:t>
+      </w:r>
+    </w:p>
+    <w:p>
+      <w:pPr>
+        <w:spacing w:after="0"/>
+      </w:pPr>
+    </w:p>
+    <w:p>
+      <w:pPr>
+        <w:spacing w:after="0"/>
+      </w:pPr>
+      <w:r>
+        <w:tab/>
+      </w:r>
+      <w:r>
+        <w:t>DECLARE UNSIGNED INTEGER  ulAltitudeValue, SET AS ZERO;</w:t>
+      </w:r>
+    </w:p>
+    <w:p>
+      <w:pPr>
         <w:spacing w:after="0"/>
         <w:ind w:firstLine="720"/>
       </w:pPr>
+      <w:r>
+        <w:t xml:space="preserve">     WHILE MONITOR THE SYSTEM</w:t>
+      </w:r>
     </w:p>
     <w:p>
       <w:pPr>
         <w:spacing w:after="0"/>
-        <w:ind w:firstLine="720"/>
-      </w:pPr>
-      <w:r>
-        <w:t>IF</w:t>
-      </w:r>
-      <w:r>
-        <w:t xml:space="preserve"> </w:t>
-      </w:r>
-      <w:r>
-        <w:t>thread1</w:t>
-      </w:r>
-      <w:r>
-        <w:t xml:space="preserve"> AND </w:t>
-      </w:r>
-      <w:r>
-        <w:t>thread2</w:t>
-      </w:r>
-      <w:r>
-        <w:t xml:space="preserve"> AND </w:t>
-      </w:r>
-      <w:r>
-        <w:t>thread3</w:t>
-      </w:r>
-      <w:r>
-        <w:t xml:space="preserve"> ARE VALID</w:t>
+        <w:ind w:left="720" w:firstLine="720"/>
+      </w:pPr>
+      <w:r>
+        <w:t>DEQUEUE DATA</w:t>
       </w:r>
     </w:p>
     <w:p>
       <w:pPr>
         <w:spacing w:after="0"/>
-        <w:ind w:firstLine="720"/>
-      </w:pPr>
-      <w:r>
-        <w:t xml:space="preserve">  </w:t>
-      </w:r>
-      <w:r>
-        <w:t xml:space="preserve"> </w:t>
-      </w:r>
-      <w:r>
-        <w:t xml:space="preserve">WAIT FOR THREAD TO EXECUTE </w:t>
-      </w:r>
-      <w:r>
-        <w:t>Its</w:t>
-      </w:r>
-      <w:r>
-        <w:t xml:space="preserve"> FUNCTION</w:t>
+      </w:pPr>
+      <w:r>
+        <w:tab/>
+      </w:r>
+      <w:r>
+        <w:tab/>
+      </w:r>
+      <w:r>
+        <w:t>ASSIGN DATA TO ulAltitudeValue</w:t>
       </w:r>
     </w:p>
     <w:p>
@@ -2113,13 +1499,28 @@
         <w:spacing w:after="0"/>
       </w:pPr>
       <w:r>
-        <w:t xml:space="preserve">    </w:t>
-      </w:r>
-      <w:r>
         <w:tab/>
       </w:r>
       <w:r>
-        <w:t>ELSE</w:t>
+        <w:tab/>
+      </w:r>
+      <w:r>
+        <w:t xml:space="preserve">IF </w:t>
+      </w:r>
+      <w:r>
+        <w:t xml:space="preserve">( </w:t>
+      </w:r>
+      <w:r>
+        <w:t xml:space="preserve"> FUNCTION </w:t>
+      </w:r>
+      <w:r>
+        <w:t>ProcessValidateAlititude(ulAltitudeValue)</w:t>
+      </w:r>
+      <w:r>
+        <w:t xml:space="preserve"> RETURN TRUE</w:t>
+      </w:r>
+      <w:r>
+        <w:t>)</w:t>
       </w:r>
     </w:p>
     <w:p>
@@ -2128,802 +1529,259 @@
       </w:pPr>
       <w:r>
         <w:tab/>
-        <w:t xml:space="preserve">  PRINT ERROR MESSAGE</w:t>
+      </w:r>
+      <w:r>
+        <w:tab/>
+        <w:t>SET EVENT BIT EVENT_ALARM_BIT;</w:t>
       </w:r>
     </w:p>
     <w:p>
       <w:pPr>
-        <w:spacing w:after="0"/>
-      </w:pPr>
+        <w:pStyle w:val="Heading4"/>
+      </w:pPr>
+      <w:r>
+        <w:t>3.2.6 ProcessValidateAlititude()</w:t>
+      </w:r>
       <w:r>
         <w:tab/>
-        <w:t xml:space="preserve">  RETURN</w:t>
-      </w:r>
-      <w:r>
-        <w:tab/>
-        <w:t xml:space="preserve"> </w:t>
       </w:r>
     </w:p>
     <w:p>
       <w:pPr>
-        <w:pStyle w:val="Heading4"/>
-      </w:pPr>
-      <w:r>
-        <w:t xml:space="preserve">3.2.3 </w:t>
-      </w:r>
-      <w:r>
-        <w:t>SensorReadHandler</w:t>
-      </w:r>
-      <w:r>
-        <w:t>()</w:t>
+        <w:spacing w:after="0"/>
+      </w:pPr>
+      <w:r>
+        <w:t>Validate the altitude with given ranges and threshold values.</w:t>
+      </w:r>
+      <w:r>
+        <w:tab/>
+      </w:r>
+      <w:r>
+        <w:tab/>
       </w:r>
     </w:p>
     <w:p>
-      <w:r>
-        <w:t xml:space="preserve"> </w:t>
-      </w:r>
-      <w:r>
-        <w:tab/>
-        <w:t>Manages the data flow of sensor module and message queue</w:t>
-      </w:r>
+      <w:pPr>
+        <w:spacing w:after="0"/>
+      </w:pPr>
     </w:p>
     <w:p>
       <w:pPr>
-        <w:spacing w:after="0" w:line="240" w:lineRule="auto"/>
-      </w:pPr>
-      <w:r>
-        <w:t>FUNCTION</w:t>
-      </w:r>
-      <w:r>
-        <w:t xml:space="preserve"> SensorReadHandler()</w:t>
-      </w:r>
+        <w:spacing w:after="0"/>
+      </w:pPr>
     </w:p>
     <w:p>
       <w:pPr>
-        <w:spacing w:after="0" w:line="240" w:lineRule="auto"/>
-      </w:pPr>
+        <w:spacing w:after="0"/>
+      </w:pPr>
+      <w:r>
+        <w:t xml:space="preserve">FUNCTION </w:t>
+      </w:r>
+      <w:r>
+        <w:t xml:space="preserve"> ProcessValidateAlititude(uint32_t </w:t>
+      </w:r>
+      <w:r>
+        <w:t>ulAltitudeValue</w:t>
+      </w:r>
+      <w:r>
+        <w:t>)</w:t>
+      </w:r>
     </w:p>
     <w:p>
       <w:pPr>
         <w:spacing w:after="0" w:line="240" w:lineRule="auto"/>
-      </w:pPr>
-      <w:r>
-        <w:t xml:space="preserve">   </w:t>
-      </w:r>
-      <w:r>
-        <w:tab/>
-      </w:r>
-      <w:r>
-        <w:t xml:space="preserve">DECLARE STATIC UNSIGNED INTEGER VALUE </w:t>
-      </w:r>
-      <w:r>
-        <w:t xml:space="preserve">ulAltitudeValue </w:t>
-      </w:r>
-      <w:r>
-        <w:t>, SET AS ZERO</w:t>
-      </w:r>
-      <w:r>
-        <w:t>;</w:t>
+        <w:ind w:firstLine="720"/>
+      </w:pPr>
+      <w:r>
+        <w:t>DECALRE A BOOLEAN  VARIABLE   blSetAlarm, SET AS FASLE;</w:t>
       </w:r>
     </w:p>
     <w:p>
       <w:pPr>
-        <w:spacing w:after="0" w:line="240" w:lineRule="auto"/>
-      </w:pPr>
-      <w:r>
-        <w:lastRenderedPageBreak/>
-        <w:t xml:space="preserve">    </w:t>
-      </w:r>
-      <w:r>
-        <w:tab/>
-      </w:r>
-      <w:r>
-        <w:t>DECLARE</w:t>
-      </w:r>
-      <w:r>
-        <w:t xml:space="preserve"> Timervariable</w:t>
-      </w:r>
-      <w:r>
-        <w:t xml:space="preserve"> AND ASSIGN</w:t>
-      </w:r>
-      <w:r>
-        <w:t xml:space="preserve"> TIME_INTERVAL;</w:t>
-      </w:r>
+        <w:spacing w:after="0"/>
+      </w:pPr>
     </w:p>
     <w:p>
       <w:pPr>
-        <w:spacing w:after="0" w:line="240" w:lineRule="auto"/>
-      </w:pPr>
-      <w:r>
-        <w:tab/>
+        <w:spacing w:after="0"/>
+      </w:pPr>
+      <w:r>
+        <w:t>IF MIN RANGE IS GREATER THAN ulAltitudeValue AND MAX_RANGE LESS  THAN ulAltitudeValue THEN DO</w:t>
       </w:r>
     </w:p>
     <w:p>
       <w:pPr>
-        <w:spacing w:after="0" w:line="240" w:lineRule="auto"/>
+        <w:spacing w:after="0"/>
       </w:pPr>
       <w:r>
         <w:tab/>
       </w:r>
       <w:r>
-        <w:t>DO IN A WHILE LOOP</w:t>
+        <w:t xml:space="preserve">IF </w:t>
+      </w:r>
+      <w:r>
+        <w:t xml:space="preserve">THRESHOLD_MIN </w:t>
+      </w:r>
+      <w:r>
+        <w:t xml:space="preserve">LESS THAN </w:t>
+      </w:r>
+      <w:r>
+        <w:t xml:space="preserve"> </w:t>
+      </w:r>
+      <w:r>
+        <w:t>ulAltitudeValue</w:t>
+      </w:r>
+      <w:r>
+        <w:t xml:space="preserve"> OR </w:t>
+      </w:r>
+      <w:r>
+        <w:t xml:space="preserve">THRESHOLD_MAX </w:t>
+      </w:r>
+      <w:r>
+        <w:t>GREATER THAN</w:t>
+      </w:r>
+      <w:r>
+        <w:t xml:space="preserve"> </w:t>
+      </w:r>
+      <w:r>
+        <w:t>ulAltitudeValue</w:t>
+      </w:r>
+      <w:r>
+        <w:t xml:space="preserve"> THEN DO </w:t>
       </w:r>
     </w:p>
     <w:p>
       <w:pPr>
-        <w:spacing w:after="0" w:line="240" w:lineRule="auto"/>
+        <w:spacing w:after="0"/>
       </w:pPr>
       <w:r>
         <w:tab/>
+      </w:r>
+      <w:r>
+        <w:tab/>
+      </w:r>
+      <w:r>
+        <w:t xml:space="preserve">SET </w:t>
+      </w:r>
+      <w:r>
+        <w:t xml:space="preserve"> blSetAlarm </w:t>
+      </w:r>
+      <w:r>
+        <w:t xml:space="preserve">AS </w:t>
+      </w:r>
+      <w:r>
+        <w:t xml:space="preserve"> true</w:t>
       </w:r>
     </w:p>
     <w:p>
       <w:pPr>
-        <w:spacing w:after="0" w:line="240" w:lineRule="auto"/>
+        <w:spacing w:after="0"/>
       </w:pPr>
       <w:r>
         <w:tab/>
-      </w:r>
-      <w:r>
-        <w:tab/>
-      </w:r>
-      <w:r>
-        <w:t xml:space="preserve">WAIT  </w:t>
-      </w:r>
-      <w:r>
-        <w:t>Timervariable</w:t>
-      </w:r>
-      <w:r>
-        <w:t xml:space="preserve">  REACHES TO ZERO </w:t>
       </w:r>
     </w:p>
     <w:p>
       <w:pPr>
-        <w:spacing w:after="0" w:line="240" w:lineRule="auto"/>
-        <w:ind w:left="720" w:firstLine="720"/>
-      </w:pPr>
-      <w:r>
-        <w:t>USE</w:t>
-      </w:r>
-      <w:r>
-        <w:t xml:space="preserve"> </w:t>
-      </w:r>
-      <w:r>
-        <w:t>SensorDataRead()</w:t>
-      </w:r>
-      <w:r>
-        <w:t xml:space="preserve"> FUNCTION TO READ DATA AND ASSIGN TO         </w:t>
-      </w:r>
-      <w:r>
-        <w:t>ulAltitudeValue</w:t>
+        <w:spacing w:after="0"/>
+      </w:pPr>
+      <w:r>
+        <w:t xml:space="preserve">RETURN </w:t>
+      </w:r>
+      <w:r>
+        <w:t xml:space="preserve"> blSetAlarm</w:t>
       </w:r>
     </w:p>
     <w:p>
       <w:pPr>
-        <w:spacing w:after="0" w:line="240" w:lineRule="auto"/>
-      </w:pPr>
-      <w:r>
-        <w:tab/>
-      </w:r>
-      <w:r>
-        <w:tab/>
-      </w:r>
-      <w:r>
-        <w:t xml:space="preserve">ASSIGN </w:t>
-      </w:r>
-      <w:r>
-        <w:t xml:space="preserve"> ulAltitudeValue </w:t>
-      </w:r>
-      <w:r>
-        <w:t xml:space="preserve">TO </w:t>
-      </w:r>
-      <w:r>
-        <w:t xml:space="preserve"> </w:t>
-      </w:r>
-      <w:r>
-        <w:t>MESSAGE_PACKET</w:t>
-      </w:r>
-      <w:r>
-        <w:t>;</w:t>
+        <w:pStyle w:val="Heading4"/>
+      </w:pPr>
+      <w:r>
+        <w:t>3.2.7 AlarmInfoProcessHandler()</w:t>
       </w:r>
     </w:p>
     <w:p>
-      <w:pPr>
-        <w:spacing w:after="0" w:line="240" w:lineRule="auto"/>
-      </w:pPr>
-      <w:r>
-        <w:tab/>
-      </w:r>
-      <w:r>
-        <w:tab/>
-      </w:r>
-      <w:r>
-        <w:t>PUSH</w:t>
-      </w:r>
-      <w:r>
-        <w:t xml:space="preserve"> </w:t>
-      </w:r>
-      <w:r>
-        <w:t>MESSAGE_PACKET</w:t>
-      </w:r>
-      <w:r>
-        <w:t xml:space="preserve">  TO </w:t>
-      </w:r>
-      <w:r>
-        <w:t xml:space="preserve"> </w:t>
-      </w:r>
-      <w:r>
-        <w:t>QUEUE</w:t>
-      </w:r>
-      <w:r>
-        <w:t>;</w:t>
+      <w:r>
+        <w:t>Perform alarm triggering by checking event signal.</w:t>
       </w:r>
     </w:p>
     <w:p>
       <w:pPr>
-        <w:spacing w:after="0" w:line="240" w:lineRule="auto"/>
-      </w:pPr>
-      <w:r>
-        <w:tab/>
-      </w:r>
-      <w:r>
-        <w:tab/>
-      </w:r>
-      <w:r>
-        <w:t xml:space="preserve">RESET THE </w:t>
-      </w:r>
-      <w:r>
-        <w:t xml:space="preserve">Timervariable </w:t>
-      </w:r>
-      <w:r>
-        <w:t xml:space="preserve">BY </w:t>
-      </w:r>
-      <w:r>
-        <w:t xml:space="preserve"> TIME_INTERVAL;</w:t>
+        <w:spacing w:after="0"/>
+      </w:pPr>
+      <w:r>
+        <w:t>FUNCTION</w:t>
+      </w:r>
+      <w:r>
+        <w:t xml:space="preserve"> AlarmInfoProcessHandler(void* arg)</w:t>
       </w:r>
     </w:p>
     <w:p>
       <w:pPr>
-        <w:spacing w:after="0" w:line="240" w:lineRule="auto"/>
-      </w:pPr>
-      <w:r>
-        <w:tab/>
+        <w:spacing w:after="0"/>
+        <w:ind w:firstLine="720"/>
+      </w:pPr>
+      <w:r>
+        <w:t>WHILE MONITOR THE SYSTEM</w:t>
       </w:r>
     </w:p>
     <w:p>
       <w:pPr>
-        <w:spacing w:after="0" w:line="240" w:lineRule="auto"/>
-      </w:pPr>
+        <w:spacing w:after="0"/>
+      </w:pPr>
+      <w:r>
+        <w:tab/>
+      </w:r>
+      <w:r>
+        <w:t xml:space="preserve"> </w:t>
+      </w:r>
+      <w:r>
+        <w:t xml:space="preserve"> </w:t>
+      </w:r>
+      <w:r>
+        <w:t xml:space="preserve"> IF </w:t>
+      </w:r>
+      <w:r>
+        <w:t>EVENT</w:t>
+      </w:r>
+      <w:r>
+        <w:t xml:space="preserve"> ALARM BIT SET THEN DO</w:t>
+      </w:r>
     </w:p>
     <w:p>
       <w:pPr>
-        <w:pStyle w:val="Heading4"/>
-      </w:pPr>
-      <w:r>
-        <w:t xml:space="preserve">3.2.4 </w:t>
-      </w:r>
-      <w:r>
-        <w:t>SensorDataRead</w:t>
-      </w:r>
-      <w:r>
-        <w:t>();</w:t>
+        <w:spacing w:after="0"/>
+      </w:pPr>
+      <w:r>
+        <w:tab/>
+      </w:r>
+      <w:r>
+        <w:tab/>
+      </w:r>
+      <w:r>
+        <w:tab/>
+      </w:r>
+      <w:r>
+        <w:t>TRIGGER ALARM UPTO ALARM_TIMEOUT</w:t>
       </w:r>
     </w:p>
     <w:p>
       <w:pPr>
-        <w:spacing w:after="0" w:line="240" w:lineRule="auto"/>
-      </w:pPr>
-      <w:r>
-        <w:t>Read data from sensor module</w:t>
+        <w:spacing w:after="0"/>
+      </w:pPr>
+      <w:r>
+        <w:tab/>
+      </w:r>
+      <w:r>
+        <w:tab/>
       </w:r>
     </w:p>
     <w:p>
       <w:pPr>
-        <w:spacing w:after="0" w:line="240" w:lineRule="auto"/>
-      </w:pPr>
-    </w:p>
-    <w:p>
-      <w:pPr>
-        <w:spacing w:after="0" w:line="240" w:lineRule="auto"/>
-      </w:pPr>
-      <w:r>
-        <w:t>FUNCTION</w:t>
-      </w:r>
-      <w:r>
-        <w:t xml:space="preserve"> SensorDataRead(void)</w:t>
-      </w:r>
-    </w:p>
-    <w:p>
-      <w:pPr>
-        <w:spacing w:after="0" w:line="240" w:lineRule="auto"/>
-      </w:pPr>
-    </w:p>
-    <w:p>
-      <w:pPr>
-        <w:spacing w:after="0" w:line="240" w:lineRule="auto"/>
-      </w:pPr>
-      <w:r>
-        <w:tab/>
-      </w:r>
-      <w:r>
-        <w:t>DECLARE UNSIGNED INTEGER  ulAltitudeValue, SET AS ZERO;</w:t>
-      </w:r>
-    </w:p>
-    <w:p>
-      <w:pPr>
-        <w:spacing w:after="0" w:line="240" w:lineRule="auto"/>
-      </w:pPr>
-      <w:r>
-        <w:tab/>
-      </w:r>
-    </w:p>
-    <w:p>
-      <w:pPr>
-        <w:spacing w:after="0" w:line="240" w:lineRule="auto"/>
-        <w:ind w:firstLine="720"/>
-      </w:pPr>
-      <w:r>
-        <w:t>READ DATA FROM SENSOR</w:t>
-      </w:r>
-    </w:p>
-    <w:p>
-      <w:pPr>
-        <w:spacing w:after="0" w:line="240" w:lineRule="auto"/>
-      </w:pPr>
-      <w:r>
-        <w:tab/>
-      </w:r>
-      <w:r>
-        <w:t xml:space="preserve">ASSIGN DATA </w:t>
-      </w:r>
-      <w:r>
-        <w:t xml:space="preserve"> </w:t>
-      </w:r>
-      <w:r>
-        <w:t xml:space="preserve">TO </w:t>
-      </w:r>
-      <w:r>
-        <w:t xml:space="preserve"> </w:t>
-      </w:r>
-      <w:r>
-        <w:t>ulAltitudeValue</w:t>
-      </w:r>
-    </w:p>
-    <w:p>
-      <w:pPr>
-        <w:spacing w:after="0" w:line="240" w:lineRule="auto"/>
-      </w:pPr>
-      <w:r>
-        <w:tab/>
-      </w:r>
-      <w:r>
-        <w:t>RETURN THE VARIABLE</w:t>
-      </w:r>
-      <w:r>
-        <w:t xml:space="preserve"> ulAltitudeValue</w:t>
-      </w:r>
-    </w:p>
-    <w:p>
-      <w:pPr>
-        <w:spacing w:after="0" w:line="240" w:lineRule="auto"/>
-      </w:pPr>
-    </w:p>
-    <w:p>
-      <w:pPr>
-        <w:pStyle w:val="Heading4"/>
-      </w:pPr>
-      <w:r>
-        <w:t>3.2.5</w:t>
-      </w:r>
-      <w:r>
-        <w:t xml:space="preserve"> </w:t>
-      </w:r>
-      <w:r>
-        <w:t>ProcessSensorData</w:t>
-      </w:r>
-      <w:r>
-        <w:t xml:space="preserve"> </w:t>
-      </w:r>
-    </w:p>
-    <w:p>
-      <w:pPr>
-        <w:spacing w:after="0" w:line="240" w:lineRule="auto"/>
-      </w:pPr>
-      <w:r>
-        <w:t>Deque the data , validate and set event flag</w:t>
-      </w:r>
-    </w:p>
-    <w:p>
-      <w:pPr>
-        <w:spacing w:after="0" w:line="240" w:lineRule="auto"/>
-      </w:pPr>
-    </w:p>
-    <w:p>
-      <w:pPr>
-        <w:spacing w:after="0"/>
-      </w:pPr>
-      <w:r>
-        <w:t xml:space="preserve">FUNCTION </w:t>
-      </w:r>
-      <w:r>
-        <w:t>ProcessSensorData(void* arg)</w:t>
-      </w:r>
-    </w:p>
-    <w:p>
-      <w:pPr>
-        <w:spacing w:after="0"/>
-      </w:pPr>
-    </w:p>
-    <w:p>
-      <w:pPr>
-        <w:spacing w:after="0"/>
-      </w:pPr>
-      <w:r>
-        <w:tab/>
-      </w:r>
-      <w:r>
-        <w:t>DECLARE UNSIGNED INTEGER  ulAltitudeValue, SET AS ZERO;</w:t>
-      </w:r>
-    </w:p>
-    <w:p>
-      <w:pPr>
-        <w:spacing w:after="0"/>
-        <w:ind w:firstLine="720"/>
-      </w:pPr>
-      <w:r>
-        <w:t xml:space="preserve">     </w:t>
-      </w:r>
-      <w:r>
-        <w:t>WHILE MONITOR THE SYSTEM</w:t>
-      </w:r>
-    </w:p>
-    <w:p>
-      <w:pPr>
-        <w:spacing w:after="0"/>
-        <w:ind w:left="720" w:firstLine="720"/>
-      </w:pPr>
-      <w:r>
-        <w:t>DEQUEUE DATA</w:t>
-      </w:r>
-    </w:p>
-    <w:p>
-      <w:pPr>
-        <w:spacing w:after="0"/>
-      </w:pPr>
-      <w:r>
-        <w:tab/>
-      </w:r>
-      <w:r>
-        <w:tab/>
-      </w:r>
-      <w:r>
-        <w:t>ASSIGN DATA TO ulAltitudeValue</w:t>
-      </w:r>
-    </w:p>
-    <w:p>
-      <w:pPr>
-        <w:spacing w:after="0"/>
-      </w:pPr>
-      <w:r>
-        <w:tab/>
-      </w:r>
-      <w:r>
-        <w:tab/>
-      </w:r>
-      <w:r>
-        <w:t xml:space="preserve">IF </w:t>
-      </w:r>
-      <w:r>
-        <w:t xml:space="preserve">( </w:t>
-      </w:r>
-      <w:r>
-        <w:t xml:space="preserve"> FUNCTION </w:t>
-      </w:r>
-      <w:r>
-        <w:t>ProcessValidateAlititude(ulAltitudeValue)</w:t>
-      </w:r>
-      <w:r>
-        <w:t xml:space="preserve"> RETURN TRUE</w:t>
-      </w:r>
-      <w:r>
-        <w:t>)</w:t>
-      </w:r>
-    </w:p>
-    <w:p>
-      <w:pPr>
-        <w:spacing w:after="0"/>
-      </w:pPr>
-      <w:r>
-        <w:tab/>
-      </w:r>
-      <w:r>
-        <w:tab/>
-        <w:t>SET EVENT BIT EVENT_ALARM_BIT;</w:t>
-      </w:r>
-    </w:p>
-    <w:p>
-      <w:pPr>
-        <w:pStyle w:val="Heading4"/>
-      </w:pPr>
-      <w:r>
-        <w:t xml:space="preserve">3.2.6 </w:t>
-      </w:r>
-      <w:r>
-        <w:t>ProcessValidateAlititude</w:t>
-      </w:r>
-      <w:r>
-        <w:t>()</w:t>
-      </w:r>
-      <w:r>
-        <w:tab/>
-      </w:r>
-    </w:p>
-    <w:p>
-      <w:pPr>
-        <w:spacing w:after="0"/>
-      </w:pPr>
-      <w:r>
-        <w:t>Validate the altitude with given ranges and threshold values.</w:t>
-      </w:r>
-      <w:r>
-        <w:tab/>
-      </w:r>
-      <w:r>
-        <w:tab/>
-      </w:r>
-    </w:p>
-    <w:p>
-      <w:pPr>
-        <w:spacing w:after="0"/>
-      </w:pPr>
-    </w:p>
-    <w:p>
-      <w:pPr>
-        <w:spacing w:after="0"/>
-      </w:pPr>
-    </w:p>
-    <w:p>
-      <w:pPr>
-        <w:spacing w:after="0"/>
-      </w:pPr>
-      <w:r>
-        <w:t xml:space="preserve">FUNCTION </w:t>
-      </w:r>
-      <w:r>
-        <w:t xml:space="preserve"> ProcessValidateAlititude(uint32_t </w:t>
-      </w:r>
-      <w:r>
-        <w:t>ulAltitudeValue</w:t>
-      </w:r>
-      <w:r>
-        <w:t>)</w:t>
-      </w:r>
-    </w:p>
-    <w:p>
-      <w:pPr>
-        <w:spacing w:after="0" w:line="240" w:lineRule="auto"/>
-        <w:ind w:firstLine="720"/>
-      </w:pPr>
-      <w:r>
-        <w:t>DECALRE A BOOLEAN  VARIABLE   blSetAlarm, SET AS FASLE;</w:t>
-      </w:r>
-    </w:p>
-    <w:p>
-      <w:pPr>
-        <w:spacing w:after="0"/>
-      </w:pPr>
-    </w:p>
-    <w:p>
-      <w:pPr>
-        <w:spacing w:after="0"/>
-      </w:pPr>
-      <w:r>
-        <w:t xml:space="preserve">IF </w:t>
-      </w:r>
-      <w:r>
-        <w:t xml:space="preserve">MIN RANGE </w:t>
-      </w:r>
-      <w:r>
-        <w:t xml:space="preserve">IS GREATER THAN </w:t>
-      </w:r>
-      <w:r>
-        <w:t>ulAltitudeValue</w:t>
-      </w:r>
-      <w:r>
-        <w:t xml:space="preserve"> AND </w:t>
-      </w:r>
-      <w:r>
-        <w:t>MAX_RANGE</w:t>
-      </w:r>
-      <w:r>
-        <w:t xml:space="preserve"> LESS  THAN</w:t>
-      </w:r>
-      <w:r>
-        <w:t xml:space="preserve"> ulAltitudeValue</w:t>
-      </w:r>
-      <w:r>
-        <w:t xml:space="preserve"> THEN DO</w:t>
-      </w:r>
-    </w:p>
-    <w:p>
-      <w:pPr>
-        <w:spacing w:after="0"/>
+        <w:pStyle w:val="Heading2"/>
       </w:pPr>
       <w:r>
         <w:lastRenderedPageBreak/>
-        <w:tab/>
-      </w:r>
-      <w:r>
-        <w:t xml:space="preserve">IF </w:t>
-      </w:r>
-      <w:r>
-        <w:t xml:space="preserve">THRESHOLD_MIN </w:t>
-      </w:r>
-      <w:r>
-        <w:t xml:space="preserve">LESS THAN </w:t>
-      </w:r>
-      <w:r>
-        <w:t xml:space="preserve"> </w:t>
-      </w:r>
-      <w:r>
-        <w:t>ulAltitudeValue</w:t>
-      </w:r>
-      <w:r>
-        <w:t xml:space="preserve"> OR </w:t>
-      </w:r>
-      <w:r>
-        <w:t xml:space="preserve">THRESHOLD_MAX </w:t>
-      </w:r>
-      <w:r>
-        <w:t>GREATER THAN</w:t>
-      </w:r>
-      <w:r>
-        <w:t xml:space="preserve"> </w:t>
-      </w:r>
-      <w:r>
-        <w:t>ulAltitudeValue</w:t>
-      </w:r>
-      <w:r>
-        <w:t xml:space="preserve"> THEN DO </w:t>
-      </w:r>
-    </w:p>
-    <w:p>
-      <w:pPr>
-        <w:spacing w:after="0"/>
-      </w:pPr>
-      <w:r>
-        <w:tab/>
-      </w:r>
-      <w:r>
-        <w:tab/>
-      </w:r>
-      <w:r>
-        <w:t xml:space="preserve">SET </w:t>
-      </w:r>
-      <w:r>
-        <w:t xml:space="preserve"> blSetAlarm </w:t>
-      </w:r>
-      <w:r>
-        <w:t xml:space="preserve">AS </w:t>
-      </w:r>
-      <w:r>
-        <w:t xml:space="preserve"> true</w:t>
-      </w:r>
-    </w:p>
-    <w:p>
-      <w:pPr>
-        <w:spacing w:after="0"/>
-      </w:pPr>
-      <w:r>
-        <w:tab/>
-      </w:r>
-    </w:p>
-    <w:p>
-      <w:pPr>
-        <w:spacing w:after="0"/>
-      </w:pPr>
-      <w:r>
-        <w:t xml:space="preserve">RETURN </w:t>
-      </w:r>
-      <w:r>
-        <w:t xml:space="preserve"> blSetAlarm</w:t>
-      </w:r>
-    </w:p>
-    <w:p>
-      <w:pPr>
-        <w:pStyle w:val="Heading4"/>
-      </w:pPr>
-      <w:r>
-        <w:t xml:space="preserve">3.2.7 </w:t>
-      </w:r>
-      <w:r>
-        <w:t>AlarmInfoProcessHandler</w:t>
-      </w:r>
-      <w:r>
-        <w:t>()</w:t>
-      </w:r>
-    </w:p>
-    <w:p>
-      <w:r>
-        <w:t>Perform alarm triggering by checking event signal.</w:t>
-      </w:r>
-    </w:p>
-    <w:p>
-      <w:pPr>
-        <w:spacing w:after="0"/>
-      </w:pPr>
-      <w:r>
-        <w:t>FUNCTION</w:t>
-      </w:r>
-      <w:r>
-        <w:t xml:space="preserve"> AlarmInfoProcessHandler(void* arg)</w:t>
-      </w:r>
-    </w:p>
-    <w:p>
-      <w:pPr>
-        <w:spacing w:after="0"/>
-        <w:ind w:firstLine="720"/>
-      </w:pPr>
-      <w:r>
-        <w:t>WHILE MONITOR THE SYSTEM</w:t>
-      </w:r>
-    </w:p>
-    <w:p>
-      <w:pPr>
-        <w:spacing w:after="0"/>
-      </w:pPr>
-      <w:r>
-        <w:tab/>
-      </w:r>
-      <w:r>
-        <w:t xml:space="preserve"> </w:t>
-      </w:r>
-      <w:r>
-        <w:t xml:space="preserve"> </w:t>
-      </w:r>
-      <w:r>
-        <w:t xml:space="preserve"> IF </w:t>
-      </w:r>
-      <w:r>
-        <w:t>EVENT</w:t>
-      </w:r>
-      <w:r>
-        <w:t xml:space="preserve"> ALARM BIT SET THEN DO</w:t>
-      </w:r>
-    </w:p>
-    <w:p>
-      <w:pPr>
-        <w:spacing w:after="0"/>
-      </w:pPr>
-      <w:r>
-        <w:tab/>
-      </w:r>
-      <w:r>
-        <w:tab/>
-      </w:r>
-      <w:r>
-        <w:tab/>
-      </w:r>
-      <w:r>
-        <w:t>TRIGGER ALARM UPTO ALARM_TIMEOUT</w:t>
-      </w:r>
-    </w:p>
-    <w:p>
-      <w:pPr>
-        <w:spacing w:after="0"/>
-      </w:pPr>
-      <w:r>
-        <w:tab/>
-      </w:r>
-      <w:r>
-        <w:tab/>
-      </w:r>
-    </w:p>
-    <w:p>
-      <w:pPr>
-        <w:pStyle w:val="Heading2"/>
-      </w:pPr>
-      <w:r>
         <w:t>4. Data Structures</w:t>
       </w:r>
     </w:p>
@@ -2945,6 +1803,51 @@
         <w:gridCol w:w="3369"/>
         <w:gridCol w:w="3969"/>
       </w:tblGrid>
+      <w:tr>
+        <w:tc>
+          <w:tcPr>
+            <w:tcW w:w="3369" w:type="dxa"/>
+          </w:tcPr>
+          <w:p>
+            <w:pPr>
+              <w:rPr>
+                <w:b/>
+                <w:bCs/>
+              </w:rPr>
+            </w:pPr>
+            <w:r>
+              <w:rPr>
+                <w:b/>
+                <w:bCs/>
+              </w:rPr>
+              <w:t>Variables</w:t>
+            </w:r>
+          </w:p>
+        </w:tc>
+        <w:tc>
+          <w:tcPr>
+            <w:tcW w:w="3969" w:type="dxa"/>
+          </w:tcPr>
+          <w:p>
+            <w:pPr>
+              <w:tabs>
+                <w:tab w:val="left" w:pos="260"/>
+              </w:tabs>
+              <w:rPr>
+                <w:b/>
+                <w:bCs/>
+              </w:rPr>
+            </w:pPr>
+            <w:r>
+              <w:rPr>
+                <w:b/>
+                <w:bCs/>
+              </w:rPr>
+              <w:t>Purpose</w:t>
+            </w:r>
+          </w:p>
+        </w:tc>
+      </w:tr>
       <w:tr>
         <w:tc>
           <w:tcPr>
@@ -2980,13 +1883,7 @@
           </w:tcPr>
           <w:p>
             <w:r>
-              <w:t>static</w:t>
-            </w:r>
-            <w:r>
-              <w:t xml:space="preserve"> </w:t>
-            </w:r>
-            <w:r>
-              <w:t>unint32_t ulAltitudeValue</w:t>
+              <w:t>static unint32_t ulAltitudeValue</w:t>
             </w:r>
           </w:p>
           <w:p/>
@@ -3009,10 +1906,7 @@
           </w:tcPr>
           <w:p>
             <w:r>
-              <w:t xml:space="preserve">static </w:t>
-            </w:r>
-            <w:r>
-              <w:t>bool  blReturnSuccess</w:t>
+              <w:t>static bool  blReturnSuccess</w:t>
             </w:r>
           </w:p>
           <w:p/>
@@ -3213,6 +2107,9 @@
       </w:r>
     </w:p>
     <w:p>
+      <w:pPr>
+        <w:pStyle w:val="Heading4"/>
+      </w:pPr>
       <w:r>
         <w:t xml:space="preserve"> </w:t>
       </w:r>
@@ -3281,8 +2178,10 @@
       </w:r>
     </w:p>
     <w:p>
-      <w:r>
-        <w:lastRenderedPageBreak/>
+      <w:pPr>
+        <w:pStyle w:val="Heading4"/>
+      </w:pPr>
+      <w:r>
         <w:t>5.2 Boundary Checks</w:t>
       </w:r>
     </w:p>
@@ -3311,6 +2210,9 @@
       </w:r>
     </w:p>
     <w:p>
+      <w:pPr>
+        <w:pStyle w:val="Heading4"/>
+      </w:pPr>
       <w:r>
         <w:t>5.3 Exception mechanism</w:t>
       </w:r>
@@ -3324,13 +2226,7 @@
         </w:numPr>
       </w:pPr>
       <w:r>
-        <w:t xml:space="preserve">Defined </w:t>
-      </w:r>
-      <w:r>
-        <w:t>MIN_RANGE AND MAX_RANGE</w:t>
-      </w:r>
-      <w:r>
-        <w:t xml:space="preserve"> for restrict garbage values.</w:t>
+        <w:t>Defined MIN_RANGE AND MAX_RANGE for restrict garbage values.</w:t>
       </w:r>
     </w:p>
     <w:p>
@@ -3357,6 +2253,9 @@
       </w:r>
     </w:p>
     <w:p>
+      <w:pPr>
+        <w:pStyle w:val="Heading4"/>
+      </w:pPr>
       <w:r>
         <w:t>6.1 Timing requirements</w:t>
       </w:r>
@@ -3398,7 +2297,11 @@
       </w:r>
     </w:p>
     <w:p>
-      <w:r>
+      <w:pPr>
+        <w:pStyle w:val="Heading4"/>
+      </w:pPr>
+      <w:r>
+        <w:lastRenderedPageBreak/>
         <w:t>6.2 Execution Constraints</w:t>
       </w:r>
     </w:p>
@@ -3439,6 +2342,9 @@
       </w:r>
     </w:p>
     <w:p>
+      <w:pPr>
+        <w:pStyle w:val="Heading4"/>
+      </w:pPr>
       <w:r>
         <w:t>6.3 Memory usage</w:t>
       </w:r>
@@ -3467,7 +2373,6 @@
         <w:t>CPU utilization</w:t>
       </w:r>
     </w:p>
-    <w:p/>
     <w:p>
       <w:pPr>
         <w:pStyle w:val="Heading2"/>
@@ -3485,7 +2390,13 @@
         </w:numPr>
       </w:pPr>
       <w:r>
-        <w:t>Check by changing the Threshold Values.</w:t>
+        <w:t>Check by changing the Threshold Values</w:t>
+      </w:r>
+      <w:r>
+        <w:t xml:space="preserve"> and Ranges</w:t>
+      </w:r>
+      <w:r>
+        <w:t>.</w:t>
       </w:r>
     </w:p>
     <w:p>
@@ -3500,20 +2411,209 @@
         <w:t>Changed the interval and monitor the system performance and accuracy.</w:t>
       </w:r>
     </w:p>
-    <w:p/>
     <w:p>
       <w:pPr>
-        <w:pStyle w:val="Heading2"/>
-      </w:pPr>
-      <w:r>
-        <w:t>8. Traceability</w:t>
+        <w:pStyle w:val="ListParagraph"/>
+        <w:numPr>
+          <w:ilvl w:val="0"/>
+          <w:numId w:val="25"/>
+        </w:numPr>
+      </w:pPr>
+      <w:r>
+        <w:t>Sensor failure condition.</w:t>
       </w:r>
     </w:p>
     <w:p>
-      <w:r>
-        <w:t>SRS document – Requirement and functionality analysis (V1.0)</w:t>
+      <w:pPr>
+        <w:pStyle w:val="Heading2"/>
+      </w:pPr>
+      <w:r>
+        <w:t>8. Traceability</w:t>
       </w:r>
     </w:p>
+    <w:tbl>
+      <w:tblPr>
+        <w:tblStyle w:val="TableGrid"/>
+        <w:tblW w:w="0" w:type="auto"/>
+        <w:tblLook w:val="04A0" w:firstRow="1" w:lastRow="0" w:firstColumn="1" w:lastColumn="0" w:noHBand="0" w:noVBand="1"/>
+      </w:tblPr>
+      <w:tblGrid>
+        <w:gridCol w:w="4428"/>
+        <w:gridCol w:w="1776"/>
+      </w:tblGrid>
+      <w:tr>
+        <w:tc>
+          <w:tcPr>
+            <w:tcW w:w="4428" w:type="dxa"/>
+          </w:tcPr>
+          <w:p>
+            <w:pPr>
+              <w:rPr>
+                <w:b/>
+                <w:bCs/>
+              </w:rPr>
+            </w:pPr>
+            <w:r>
+              <w:rPr>
+                <w:b/>
+                <w:bCs/>
+              </w:rPr>
+              <w:t>References</w:t>
+            </w:r>
+            <w:r>
+              <w:rPr>
+                <w:b/>
+                <w:bCs/>
+              </w:rPr>
+              <w:t>(Altitude measurement HLD</w:t>
+            </w:r>
+            <w:r>
+              <w:rPr>
+                <w:b/>
+                <w:bCs/>
+              </w:rPr>
+              <w:t>.docx</w:t>
+            </w:r>
+            <w:r>
+              <w:rPr>
+                <w:b/>
+                <w:bCs/>
+              </w:rPr>
+              <w:t>)</w:t>
+            </w:r>
+          </w:p>
+        </w:tc>
+        <w:tc>
+          <w:tcPr>
+            <w:tcW w:w="1776" w:type="dxa"/>
+          </w:tcPr>
+          <w:p>
+            <w:pPr>
+              <w:rPr>
+                <w:b/>
+                <w:bCs/>
+              </w:rPr>
+            </w:pPr>
+            <w:r>
+              <w:rPr>
+                <w:b/>
+                <w:bCs/>
+              </w:rPr>
+              <w:t>Reference ID</w:t>
+            </w:r>
+          </w:p>
+        </w:tc>
+      </w:tr>
+      <w:tr>
+        <w:tc>
+          <w:tcPr>
+            <w:tcW w:w="4428" w:type="dxa"/>
+          </w:tcPr>
+          <w:p>
+            <w:r>
+              <w:t>Module Description</w:t>
+            </w:r>
+          </w:p>
+        </w:tc>
+        <w:tc>
+          <w:tcPr>
+            <w:tcW w:w="1776" w:type="dxa"/>
+          </w:tcPr>
+          <w:p>
+            <w:r>
+              <w:t>4</w:t>
+            </w:r>
+          </w:p>
+        </w:tc>
+      </w:tr>
+      <w:tr>
+        <w:tc>
+          <w:tcPr>
+            <w:tcW w:w="4428" w:type="dxa"/>
+          </w:tcPr>
+          <w:p>
+            <w:r>
+              <w:t>Interface design</w:t>
+            </w:r>
+          </w:p>
+        </w:tc>
+        <w:tc>
+          <w:tcPr>
+            <w:tcW w:w="1776" w:type="dxa"/>
+          </w:tcPr>
+          <w:p>
+            <w:r>
+              <w:t>5</w:t>
+            </w:r>
+          </w:p>
+        </w:tc>
+      </w:tr>
+      <w:tr>
+        <w:tc>
+          <w:tcPr>
+            <w:tcW w:w="4428" w:type="dxa"/>
+          </w:tcPr>
+          <w:p>
+            <w:r>
+              <w:t>Data Flow</w:t>
+            </w:r>
+          </w:p>
+        </w:tc>
+        <w:tc>
+          <w:tcPr>
+            <w:tcW w:w="1776" w:type="dxa"/>
+          </w:tcPr>
+          <w:p>
+            <w:r>
+              <w:t>6</w:t>
+            </w:r>
+          </w:p>
+        </w:tc>
+      </w:tr>
+      <w:tr>
+        <w:tc>
+          <w:tcPr>
+            <w:tcW w:w="4428" w:type="dxa"/>
+          </w:tcPr>
+          <w:p>
+            <w:r>
+              <w:t>Error handling and fault management</w:t>
+            </w:r>
+          </w:p>
+        </w:tc>
+        <w:tc>
+          <w:tcPr>
+            <w:tcW w:w="1776" w:type="dxa"/>
+          </w:tcPr>
+          <w:p>
+            <w:r>
+              <w:t>7</w:t>
+            </w:r>
+          </w:p>
+        </w:tc>
+      </w:tr>
+      <w:tr>
+        <w:tc>
+          <w:tcPr>
+            <w:tcW w:w="4428" w:type="dxa"/>
+            <w:tcBorders>
+              <w:top w:val="single" w:sz="4" w:space="0" w:color="000000" w:themeColor="text1"/>
+            </w:tcBorders>
+          </w:tcPr>
+          <w:p/>
+        </w:tc>
+        <w:tc>
+          <w:tcPr>
+            <w:tcW w:w="1776" w:type="dxa"/>
+            <w:tcBorders>
+              <w:top w:val="single" w:sz="4" w:space="0" w:color="000000" w:themeColor="text1"/>
+            </w:tcBorders>
+          </w:tcPr>
+          <w:p/>
+        </w:tc>
+      </w:tr>
+    </w:tbl>
+    <w:p/>
     <w:sectPr>
       <w:pgSz w:w="12240" w:h="15840"/>
       <w:pgMar w:top="1440" w:right="1800" w:bottom="1440" w:left="1800" w:header="720" w:footer="720" w:gutter="0"/>

</xml_diff>